<commit_message>
fix: preserve suffix text after split variables in docx generation
- rendu_document.php: normalizeSplitVariables now keeps text after
  closing delimiter when merging split {{ VAR }} across w:t nodes
- editeur_templates.php: readDocxXml tries backslash zip entry names
- analyseur_templates.php: same backslash fallback for zip entries
- database/seed.sql: fix accented quality values (Gérant, etc.)
- cession/pv_ago steps: fix Gerant->Gérant in wizard defaults
- templates: fixed Depot-Legal zip structure, removed temp file
</commit_message>
<xml_diff>
--- a/templates/SARL/SARL_2026-07_Annonce-Legale-Journal_Template.docx
+++ b/templates/SARL/SARL_2026-07_Annonce-Legale-Journal_Template.docx
@@ -1,6 +1,6 @@
 
 <file path=word/document.xml><?xml version="1.0" encoding="utf-8"?>
-<w:document xmlns:wpc="http://schemas.microsoft.com/office/word/2010/wordprocessingCanvas" xmlns:cx="http://schemas.microsoft.com/office/drawing/2014/chartex" xmlns:cx1="http://schemas.microsoft.com/office/drawing/2015/9/8/chartex" xmlns:cx2="http://schemas.microsoft.com/office/drawing/2015/10/21/chartex" xmlns:cx3="http://schemas.microsoft.com/office/drawing/2016/5/9/chartex" xmlns:cx4="http://schemas.microsoft.com/office/drawing/2016/5/10/chartex" xmlns:cx5="http://schemas.microsoft.com/office/drawing/2016/5/11/chartex" xmlns:cx6="http://schemas.microsoft.com/office/drawing/2016/5/12/chartex" xmlns:cx7="http://schemas.microsoft.com/office/drawing/2016/5/13/chartex" xmlns:cx8="http://schemas.microsoft.com/office/drawing/2016/5/14/chartex" xmlns:mc="http://schemas.openxmlformats.org/markup-compatibility/2006" xmlns:aink="http://schemas.microsoft.com/office/drawing/2016/ink" xmlns:am3d="http://schemas.microsoft.com/office/drawing/2017/model3d" xmlns:o="urn:schemas-microsoft-com:office:office" xmlns:oel="http://schemas.microsoft.com/office/2019/extlst" xmlns:r="http://schemas.openxmlformats.org/officeDocument/2006/relationships" xmlns:m="http://schemas.openxmlformats.org/officeDocument/2006/math" xmlns:v="urn:schemas-microsoft-com:vml" xmlns:wp14="http://schemas.microsoft.com/office/word/2010/wordprocessingDrawing" xmlns:wp="http://schemas.openxmlformats.org/drawingml/2006/wordprocessingDrawing" xmlns:w10="urn:schemas-microsoft-com:office:word" xmlns:w="http://schemas.openxmlformats.org/wordprocessingml/2006/main" xmlns:w14="http://schemas.microsoft.com/office/word/2010/wordml" xmlns:w15="http://schemas.microsoft.com/office/word/2012/wordml" xmlns:w16cex="http://schemas.microsoft.com/office/word/2018/wordml/cex" xmlns:w16cid="http://schemas.microsoft.com/office/word/2016/wordml/cid" xmlns:w16="http://schemas.microsoft.com/office/word/2018/wordml" xmlns:w16sdtdh="http://schemas.microsoft.com/office/word/2020/wordml/sdtdatahash" xmlns:w16se="http://schemas.microsoft.com/office/word/2015/wordml/symex" xmlns:wpg="http://schemas.microsoft.com/office/word/2010/wordprocessingGroup" xmlns:wpi="http://schemas.microsoft.com/office/word/2010/wordprocessingInk" xmlns:wne="http://schemas.microsoft.com/office/word/2006/wordml" xmlns:wps="http://schemas.microsoft.com/office/word/2010/wordprocessingShape" mc:Ignorable="w14 w15 w16se w16cid w16 w16cex w16sdtdh wp14">
+<w:document xmlns:wpc="http://schemas.microsoft.com/office/word/2010/wordprocessingCanvas" xmlns:cx="http://schemas.microsoft.com/office/drawing/2014/chartex" xmlns:cx1="http://schemas.microsoft.com/office/drawing/2015/9/8/chartex" xmlns:cx2="http://schemas.microsoft.com/office/drawing/2015/10/21/chartex" xmlns:cx3="http://schemas.microsoft.com/office/drawing/2016/5/9/chartex" xmlns:cx4="http://schemas.microsoft.com/office/drawing/2016/5/10/chartex" xmlns:cx5="http://schemas.microsoft.com/office/drawing/2016/5/11/chartex" xmlns:cx6="http://schemas.microsoft.com/office/drawing/2016/5/12/chartex" xmlns:cx7="http://schemas.microsoft.com/office/drawing/2016/5/13/chartex" xmlns:cx8="http://schemas.microsoft.com/office/drawing/2016/5/14/chartex" xmlns:mc="http://schemas.openxmlformats.org/markup-compatibility/2006" xmlns:aink="http://schemas.microsoft.com/office/drawing/2016/ink" xmlns:am3d="http://schemas.microsoft.com/office/drawing/2017/model3d" xmlns:o="urn:schemas-microsoft-com:office:office" xmlns:oel="http://schemas.microsoft.com/office/2019/extlst" xmlns:r="http://schemas.openxmlformats.org/officeDocument/2006/relationships" xmlns:m="http://schemas.openxmlformats.org/officeDocument/2006/math" xmlns:v="urn:schemas-microsoft-com:vml" xmlns:wp14="http://schemas.microsoft.com/office/word/2010/wordprocessingDrawing" xmlns:wp="http://schemas.openxmlformats.org/drawingml/2006/wordprocessingDrawing" xmlns:w10="urn:schemas-microsoft-com:office:word" xmlns:w="http://schemas.openxmlformats.org/wordprocessingml/2006/main" xmlns:w14="http://schemas.microsoft.com/office/word/2010/wordml" xmlns:w15="http://schemas.microsoft.com/office/word/2012/wordml" xmlns:w16cex="http://schemas.microsoft.com/office/word/2018/wordml/cex" xmlns:w16cid="http://schemas.microsoft.com/office/word/2016/wordml/cid" xmlns:w16="http://schemas.microsoft.com/office/word/2018/wordml" xmlns:w16du="http://schemas.microsoft.com/office/word/2023/wordml/word16du" xmlns:w16sdtdh="http://schemas.microsoft.com/office/word/2020/wordml/sdtdatahash" xmlns:w16sdtfl="http://schemas.microsoft.com/office/word/2024/wordml/sdtformatlock" xmlns:w16se="http://schemas.microsoft.com/office/word/2015/wordml/symex" xmlns:wpg="http://schemas.microsoft.com/office/word/2010/wordprocessingGroup" xmlns:wpi="http://schemas.microsoft.com/office/word/2010/wordprocessingInk" xmlns:wne="http://schemas.microsoft.com/office/word/2006/wordml" xmlns:wps="http://schemas.microsoft.com/office/word/2010/wordprocessingShape" mc:Ignorable="w14 w15 w16se w16cid w16 w16cex w16sdtdh w16sdtfl w16du wp14">
   <w:body>
     <w:p>
       <w:pPr>
@@ -10,15 +10,23 @@
         <w:jc w:val="center"/>
         <w:rPr>
           <w:b/>
-          <w:sz w:val="18"/>
-          <w:szCs w:val="18"/>
-        </w:rPr>
-      </w:pPr>
-      <w:r>
-        <w:rPr>
-          <w:b/>
-          <w:sz w:val="18"/>
-          <w:szCs w:val="18"/>
+          <w:sz w:val="22"/>
+          <w:szCs w:val="22"/>
+        </w:rPr>
+      </w:pPr>
+      <w:r>
+        <w:rPr>
+          <w:b/>
+          <w:sz w:val="22"/>
+          <w:szCs w:val="22"/>
+        </w:rPr>
+        <w:t xml:space="preserve">Avis de </w:t>
+      </w:r>
+      <w:r>
+        <w:rPr>
+          <w:b/>
+          <w:sz w:val="22"/>
+          <w:szCs w:val="22"/>
         </w:rPr>
         <w:t>Constitution de la société</w:t>
       </w:r>
@@ -31,42 +39,98 @@
         <w:jc w:val="center"/>
         <w:rPr>
           <w:b/>
-          <w:sz w:val="18"/>
-          <w:szCs w:val="18"/>
-        </w:rPr>
-      </w:pPr>
-      <w:r>
-        <w:rPr>
-          <w:b/>
-          <w:sz w:val="18"/>
-          <w:szCs w:val="18"/>
+          <w:sz w:val="22"/>
+          <w:szCs w:val="22"/>
+        </w:rPr>
+      </w:pPr>
+      <w:r>
+        <w:rPr>
+          <w:b/>
+          <w:sz w:val="22"/>
+          <w:szCs w:val="22"/>
         </w:rPr>
         <w:t>"</w:t>
       </w:r>
       <w:r>
         <w:rPr>
           <w:b/>
-          <w:sz w:val="18"/>
-          <w:szCs w:val="18"/>
+          <w:sz w:val="22"/>
+          <w:szCs w:val="22"/>
         </w:rPr>
         <w:t xml:space="preserve"> </w:t>
       </w:r>
-      <w:r>
-        <w:rPr>
-          <w:b/>
-          <w:sz w:val="18"/>
-          <w:szCs w:val="18"/>
-        </w:rPr>
-        <w:t>{{ SOCIETE_RAISON_SOCIALE }} {{ SOCIETE_FORME_JURIDIQUE }}</w:t>
-      </w:r>
-      <w:r>
-        <w:rPr>
-          <w:b/>
-          <w:sz w:val="18"/>
-          <w:szCs w:val="18"/>
+      <w:proofErr w:type="gramStart"/>
+      <w:r>
+        <w:rPr>
+          <w:b/>
+          <w:sz w:val="22"/>
+          <w:szCs w:val="22"/>
+        </w:rPr>
+        <w:t>{{ SOCIETE</w:t>
+      </w:r>
+      <w:proofErr w:type="gramEnd"/>
+      <w:r>
+        <w:rPr>
+          <w:b/>
+          <w:sz w:val="22"/>
+          <w:szCs w:val="22"/>
+        </w:rPr>
+        <w:t>_RAISON_</w:t>
+      </w:r>
+      <w:proofErr w:type="gramStart"/>
+      <w:r>
+        <w:rPr>
+          <w:b/>
+          <w:sz w:val="22"/>
+          <w:szCs w:val="22"/>
+        </w:rPr>
+        <w:t>SOCIALE }</w:t>
+      </w:r>
+      <w:proofErr w:type="gramEnd"/>
+      <w:r>
+        <w:rPr>
+          <w:b/>
+          <w:sz w:val="22"/>
+          <w:szCs w:val="22"/>
+        </w:rPr>
+        <w:t xml:space="preserve">} </w:t>
+      </w:r>
+      <w:proofErr w:type="gramStart"/>
+      <w:r>
+        <w:rPr>
+          <w:b/>
+          <w:sz w:val="22"/>
+          <w:szCs w:val="22"/>
+        </w:rPr>
+        <w:t>{{ SOCIETE</w:t>
+      </w:r>
+      <w:proofErr w:type="gramEnd"/>
+      <w:r>
+        <w:rPr>
+          <w:b/>
+          <w:sz w:val="22"/>
+          <w:szCs w:val="22"/>
+        </w:rPr>
+        <w:t>_FORME_</w:t>
+      </w:r>
+      <w:proofErr w:type="gramStart"/>
+      <w:r>
+        <w:rPr>
+          <w:b/>
+          <w:sz w:val="22"/>
+          <w:szCs w:val="22"/>
+        </w:rPr>
+        <w:t>JURIDIQUE }}</w:t>
+      </w:r>
+      <w:r>
+        <w:rPr>
+          <w:b/>
+          <w:sz w:val="22"/>
+          <w:szCs w:val="22"/>
         </w:rPr>
         <w:t>"</w:t>
       </w:r>
+      <w:proofErr w:type="gramEnd"/>
     </w:p>
     <w:p>
       <w:pPr>
@@ -74,8 +138,8 @@
         <w:jc w:val="both"/>
         <w:rPr>
           <w:b/>
-          <w:sz w:val="18"/>
-          <w:szCs w:val="18"/>
+          <w:sz w:val="22"/>
+          <w:szCs w:val="22"/>
           <w:lang w:val="fr-CA"/>
         </w:rPr>
       </w:pPr>
@@ -86,16 +150,16 @@
         <w:rPr>
           <w:rFonts w:asciiTheme="majorBidi" w:hAnsiTheme="majorBidi" w:cstheme="majorBidi"/>
           <w:bCs/>
-          <w:sz w:val="18"/>
-          <w:szCs w:val="18"/>
-        </w:rPr>
-      </w:pPr>
-      <w:r>
-        <w:rPr>
-          <w:rFonts w:asciiTheme="majorBidi" w:hAnsiTheme="majorBidi" w:cstheme="majorBidi"/>
-          <w:b/>
-          <w:sz w:val="18"/>
-          <w:szCs w:val="18"/>
+          <w:sz w:val="22"/>
+          <w:szCs w:val="22"/>
+        </w:rPr>
+      </w:pPr>
+      <w:r>
+        <w:rPr>
+          <w:rFonts w:asciiTheme="majorBidi" w:hAnsiTheme="majorBidi" w:cstheme="majorBidi"/>
+          <w:b/>
+          <w:sz w:val="22"/>
+          <w:szCs w:val="22"/>
         </w:rPr>
         <w:t>I/</w:t>
       </w:r>
@@ -103,8 +167,8 @@
         <w:rPr>
           <w:rFonts w:asciiTheme="majorBidi" w:hAnsiTheme="majorBidi" w:cstheme="majorBidi"/>
           <w:bCs/>
-          <w:sz w:val="18"/>
-          <w:szCs w:val="18"/>
+          <w:sz w:val="22"/>
+          <w:szCs w:val="22"/>
         </w:rPr>
         <w:t xml:space="preserve"> Aux termes d’un acte sous </w:t>
       </w:r>
@@ -112,8 +176,8 @@
         <w:rPr>
           <w:rFonts w:asciiTheme="majorBidi" w:hAnsiTheme="majorBidi" w:cstheme="majorBidi"/>
           <w:bCs/>
-          <w:sz w:val="18"/>
-          <w:szCs w:val="18"/>
+          <w:sz w:val="22"/>
+          <w:szCs w:val="22"/>
         </w:rPr>
         <w:t>seing privé</w:t>
       </w:r>
@@ -121,8 +185,8 @@
         <w:rPr>
           <w:rFonts w:asciiTheme="majorBidi" w:hAnsiTheme="majorBidi" w:cstheme="majorBidi"/>
           <w:bCs/>
-          <w:sz w:val="18"/>
-          <w:szCs w:val="18"/>
+          <w:sz w:val="22"/>
+          <w:szCs w:val="22"/>
         </w:rPr>
         <w:t xml:space="preserve"> établi à Casa, le</w:t>
       </w:r>
@@ -130,26 +194,57 @@
         <w:rPr>
           <w:rFonts w:asciiTheme="majorBidi" w:hAnsiTheme="majorBidi" w:cstheme="majorBidi"/>
           <w:bCs/>
-          <w:sz w:val="18"/>
-          <w:szCs w:val="18"/>
+          <w:sz w:val="22"/>
+          <w:szCs w:val="22"/>
         </w:rPr>
         <w:t xml:space="preserve"> </w:t>
       </w:r>
-      <w:r>
-        <w:rPr>
-          <w:rFonts w:asciiTheme="majorBidi" w:hAnsiTheme="majorBidi" w:cstheme="majorBidi"/>
-          <w:b/>
-          <w:sz w:val="18"/>
-          <w:szCs w:val="18"/>
-        </w:rPr>
-        <w:t>{{ CONTRAT_TYPE }}</w:t>
-      </w:r>
-      <w:r>
-        <w:rPr>
-          <w:rFonts w:asciiTheme="majorBidi" w:hAnsiTheme="majorBidi" w:cstheme="majorBidi"/>
-          <w:b/>
-          <w:sz w:val="18"/>
-          <w:szCs w:val="18"/>
+      <w:proofErr w:type="gramStart"/>
+      <w:r>
+        <w:rPr>
+          <w:rFonts w:asciiTheme="majorBidi" w:hAnsiTheme="majorBidi" w:cstheme="majorBidi"/>
+          <w:b/>
+          <w:sz w:val="22"/>
+          <w:szCs w:val="22"/>
+        </w:rPr>
+        <w:t>{{ CONTRAT</w:t>
+      </w:r>
+      <w:proofErr w:type="gramEnd"/>
+      <w:r>
+        <w:rPr>
+          <w:rFonts w:asciiTheme="majorBidi" w:hAnsiTheme="majorBidi" w:cstheme="majorBidi"/>
+          <w:b/>
+          <w:sz w:val="22"/>
+          <w:szCs w:val="22"/>
+        </w:rPr>
+        <w:t>_</w:t>
+      </w:r>
+      <w:proofErr w:type="gramStart"/>
+      <w:r>
+        <w:rPr>
+          <w:rFonts w:asciiTheme="majorBidi" w:hAnsiTheme="majorBidi" w:cstheme="majorBidi"/>
+          <w:b/>
+          <w:sz w:val="22"/>
+          <w:szCs w:val="22"/>
+        </w:rPr>
+        <w:t>DATE }</w:t>
+      </w:r>
+      <w:proofErr w:type="gramEnd"/>
+      <w:r>
+        <w:rPr>
+          <w:rFonts w:asciiTheme="majorBidi" w:hAnsiTheme="majorBidi" w:cstheme="majorBidi"/>
+          <w:b/>
+          <w:sz w:val="22"/>
+          <w:szCs w:val="22"/>
+        </w:rPr>
+        <w:t>}</w:t>
+      </w:r>
+      <w:r>
+        <w:rPr>
+          <w:rFonts w:asciiTheme="majorBidi" w:hAnsiTheme="majorBidi" w:cstheme="majorBidi"/>
+          <w:b/>
+          <w:sz w:val="22"/>
+          <w:szCs w:val="22"/>
         </w:rPr>
         <w:t>,</w:t>
       </w:r>
@@ -157,8 +252,8 @@
         <w:rPr>
           <w:rFonts w:asciiTheme="majorBidi" w:hAnsiTheme="majorBidi" w:cstheme="majorBidi"/>
           <w:bCs/>
-          <w:sz w:val="18"/>
-          <w:szCs w:val="18"/>
+          <w:sz w:val="22"/>
+          <w:szCs w:val="22"/>
         </w:rPr>
         <w:t xml:space="preserve"> il</w:t>
       </w:r>
@@ -166,8 +261,8 @@
         <w:rPr>
           <w:rFonts w:asciiTheme="majorBidi" w:hAnsiTheme="majorBidi" w:cstheme="majorBidi"/>
           <w:bCs/>
-          <w:sz w:val="18"/>
-          <w:szCs w:val="18"/>
+          <w:sz w:val="22"/>
+          <w:szCs w:val="22"/>
         </w:rPr>
         <w:t xml:space="preserve"> a été </w:t>
       </w:r>
@@ -175,8 +270,8 @@
         <w:rPr>
           <w:rFonts w:asciiTheme="majorBidi" w:hAnsiTheme="majorBidi" w:cstheme="majorBidi"/>
           <w:bCs/>
-          <w:sz w:val="18"/>
-          <w:szCs w:val="18"/>
+          <w:sz w:val="22"/>
+          <w:szCs w:val="22"/>
         </w:rPr>
         <w:t>établi les</w:t>
       </w:r>
@@ -184,44 +279,57 @@
         <w:rPr>
           <w:rFonts w:asciiTheme="majorBidi" w:hAnsiTheme="majorBidi" w:cstheme="majorBidi"/>
           <w:bCs/>
-          <w:sz w:val="18"/>
-          <w:szCs w:val="18"/>
-        </w:rPr>
-        <w:t xml:space="preserve"> Statuts </w:t>
-      </w:r>
-      <w:r>
-        <w:rPr>
-          <w:rFonts w:asciiTheme="majorBidi" w:hAnsiTheme="majorBidi" w:cstheme="majorBidi"/>
-          <w:bCs/>
-          <w:sz w:val="18"/>
-          <w:szCs w:val="18"/>
-        </w:rPr>
-        <w:t xml:space="preserve">d’une </w:t>
-      </w:r>
-      <w:r>
-        <w:rPr>
-          <w:rFonts w:asciiTheme="majorBidi" w:hAnsiTheme="majorBidi" w:cstheme="majorBidi"/>
-          <w:bCs/>
-          <w:sz w:val="18"/>
-          <w:szCs w:val="18"/>
-        </w:rPr>
-        <w:t>{{ SOCIETE_FORME_JURIDIQUE }}</w:t>
-      </w:r>
-      <w:r>
-        <w:rPr>
-          <w:rFonts w:asciiTheme="majorBidi" w:hAnsiTheme="majorBidi" w:cstheme="majorBidi"/>
-          <w:bCs/>
-          <w:sz w:val="18"/>
-          <w:szCs w:val="18"/>
-        </w:rPr>
-        <w:t xml:space="preserve"> </w:t>
-      </w:r>
-      <w:r>
-        <w:rPr>
-          <w:rFonts w:asciiTheme="majorBidi" w:hAnsiTheme="majorBidi" w:cstheme="majorBidi"/>
-          <w:bCs/>
-          <w:sz w:val="18"/>
-          <w:szCs w:val="18"/>
+          <w:sz w:val="22"/>
+          <w:szCs w:val="22"/>
+        </w:rPr>
+        <w:t xml:space="preserve"> Statuts d’une </w:t>
+      </w:r>
+      <w:proofErr w:type="gramStart"/>
+      <w:r>
+        <w:rPr>
+          <w:rFonts w:asciiTheme="majorBidi" w:hAnsiTheme="majorBidi" w:cstheme="majorBidi"/>
+          <w:b/>
+          <w:sz w:val="22"/>
+          <w:szCs w:val="22"/>
+        </w:rPr>
+        <w:t>{{ SOCIETE</w:t>
+      </w:r>
+      <w:proofErr w:type="gramEnd"/>
+      <w:r>
+        <w:rPr>
+          <w:rFonts w:asciiTheme="majorBidi" w:hAnsiTheme="majorBidi" w:cstheme="majorBidi"/>
+          <w:b/>
+          <w:sz w:val="22"/>
+          <w:szCs w:val="22"/>
+        </w:rPr>
+        <w:t>_FORME_</w:t>
+      </w:r>
+      <w:proofErr w:type="gramStart"/>
+      <w:r>
+        <w:rPr>
+          <w:rFonts w:asciiTheme="majorBidi" w:hAnsiTheme="majorBidi" w:cstheme="majorBidi"/>
+          <w:b/>
+          <w:sz w:val="22"/>
+          <w:szCs w:val="22"/>
+        </w:rPr>
+        <w:t>JURIDIQUE }</w:t>
+      </w:r>
+      <w:proofErr w:type="gramEnd"/>
+      <w:r>
+        <w:rPr>
+          <w:rFonts w:asciiTheme="majorBidi" w:hAnsiTheme="majorBidi" w:cstheme="majorBidi"/>
+          <w:bCs/>
+          <w:sz w:val="22"/>
+          <w:szCs w:val="22"/>
+        </w:rPr>
+        <w:t xml:space="preserve">} </w:t>
+      </w:r>
+      <w:r>
+        <w:rPr>
+          <w:rFonts w:asciiTheme="majorBidi" w:hAnsiTheme="majorBidi" w:cstheme="majorBidi"/>
+          <w:bCs/>
+          <w:sz w:val="22"/>
+          <w:szCs w:val="22"/>
         </w:rPr>
         <w:t>dont</w:t>
       </w:r>
@@ -229,11 +337,22 @@
         <w:rPr>
           <w:rFonts w:asciiTheme="majorBidi" w:hAnsiTheme="majorBidi" w:cstheme="majorBidi"/>
           <w:bCs/>
-          <w:sz w:val="18"/>
-          <w:szCs w:val="18"/>
+          <w:sz w:val="22"/>
+          <w:szCs w:val="22"/>
         </w:rPr>
         <w:t xml:space="preserve"> les caractéristiques sont les suivantes :</w:t>
       </w:r>
+    </w:p>
+    <w:p>
+      <w:pPr>
+        <w:jc w:val="both"/>
+        <w:rPr>
+          <w:rFonts w:asciiTheme="majorBidi" w:hAnsiTheme="majorBidi" w:cstheme="majorBidi"/>
+          <w:bCs/>
+          <w:sz w:val="22"/>
+          <w:szCs w:val="22"/>
+        </w:rPr>
+      </w:pPr>
     </w:p>
     <w:p>
       <w:pPr>
@@ -242,45 +361,64 @@
           <w:ilvl w:val="0"/>
           <w:numId w:val="10"/>
         </w:numPr>
+        <w:spacing w:line="360" w:lineRule="auto"/>
         <w:ind w:left="567"/>
         <w:jc w:val="both"/>
         <w:rPr>
           <w:rFonts w:asciiTheme="majorBidi" w:hAnsiTheme="majorBidi" w:cstheme="majorBidi"/>
           <w:bCs/>
-          <w:sz w:val="18"/>
-          <w:szCs w:val="18"/>
-        </w:rPr>
-      </w:pPr>
-      <w:r>
-        <w:rPr>
-          <w:rFonts w:asciiTheme="majorBidi" w:hAnsiTheme="majorBidi" w:cstheme="majorBidi"/>
-          <w:b/>
-          <w:bCs/>
-          <w:sz w:val="18"/>
-          <w:szCs w:val="18"/>
+          <w:sz w:val="22"/>
+          <w:szCs w:val="22"/>
+        </w:rPr>
+      </w:pPr>
+      <w:r>
+        <w:rPr>
+          <w:rFonts w:asciiTheme="majorBidi" w:hAnsiTheme="majorBidi" w:cstheme="majorBidi"/>
+          <w:b/>
+          <w:bCs/>
+          <w:sz w:val="22"/>
+          <w:szCs w:val="22"/>
         </w:rPr>
         <w:t xml:space="preserve">Dénomination : </w:t>
       </w:r>
       <w:r>
         <w:rPr>
-          <w:sz w:val="18"/>
-          <w:szCs w:val="18"/>
+          <w:sz w:val="22"/>
+          <w:szCs w:val="22"/>
         </w:rPr>
         <w:t>« </w:t>
       </w:r>
-      <w:r>
-        <w:rPr>
-          <w:sz w:val="18"/>
-          <w:szCs w:val="18"/>
-        </w:rPr>
-        <w:t>{{ SOCIETE_RAISON_SOCIALE }}</w:t>
-      </w:r>
-      <w:r>
-        <w:rPr>
-          <w:sz w:val="18"/>
-          <w:szCs w:val="18"/>
-        </w:rPr>
-        <w:t> »</w:t>
+      <w:proofErr w:type="gramStart"/>
+      <w:r>
+        <w:rPr>
+          <w:sz w:val="22"/>
+          <w:szCs w:val="22"/>
+        </w:rPr>
+        <w:t>{{ SOCIETE</w:t>
+      </w:r>
+      <w:proofErr w:type="gramEnd"/>
+      <w:r>
+        <w:rPr>
+          <w:sz w:val="22"/>
+          <w:szCs w:val="22"/>
+        </w:rPr>
+        <w:t>_RAISON_</w:t>
+      </w:r>
+      <w:proofErr w:type="gramStart"/>
+      <w:r>
+        <w:rPr>
+          <w:sz w:val="22"/>
+          <w:szCs w:val="22"/>
+        </w:rPr>
+        <w:t>SOCIALE }</w:t>
+      </w:r>
+      <w:proofErr w:type="gramEnd"/>
+      <w:r>
+        <w:rPr>
+          <w:sz w:val="22"/>
+          <w:szCs w:val="22"/>
+        </w:rPr>
+        <w:t>} »</w:t>
       </w:r>
     </w:p>
     <w:p>
@@ -290,21 +428,22 @@
           <w:ilvl w:val="0"/>
           <w:numId w:val="10"/>
         </w:numPr>
+        <w:spacing w:line="360" w:lineRule="auto"/>
         <w:ind w:left="567"/>
         <w:jc w:val="both"/>
         <w:rPr>
           <w:rFonts w:asciiTheme="majorBidi" w:hAnsiTheme="majorBidi" w:cstheme="majorBidi"/>
           <w:bCs/>
-          <w:sz w:val="18"/>
-          <w:szCs w:val="18"/>
-        </w:rPr>
-      </w:pPr>
-      <w:r>
-        <w:rPr>
-          <w:rFonts w:asciiTheme="majorBidi" w:hAnsiTheme="majorBidi" w:cstheme="majorBidi"/>
-          <w:b/>
-          <w:sz w:val="18"/>
-          <w:szCs w:val="18"/>
+          <w:sz w:val="22"/>
+          <w:szCs w:val="22"/>
+        </w:rPr>
+      </w:pPr>
+      <w:r>
+        <w:rPr>
+          <w:rFonts w:asciiTheme="majorBidi" w:hAnsiTheme="majorBidi" w:cstheme="majorBidi"/>
+          <w:b/>
+          <w:sz w:val="22"/>
+          <w:szCs w:val="22"/>
         </w:rPr>
         <w:t>Objet</w:t>
       </w:r>
@@ -312,8 +451,8 @@
         <w:rPr>
           <w:rFonts w:asciiTheme="majorBidi" w:hAnsiTheme="majorBidi" w:cstheme="majorBidi"/>
           <w:bCs/>
-          <w:sz w:val="18"/>
-          <w:szCs w:val="18"/>
+          <w:sz w:val="22"/>
+          <w:szCs w:val="22"/>
         </w:rPr>
         <w:t> </w:t>
       </w:r>
@@ -321,121 +460,50 @@
         <w:rPr>
           <w:rFonts w:asciiTheme="majorBidi" w:hAnsiTheme="majorBidi" w:cstheme="majorBidi"/>
           <w:b/>
-          <w:sz w:val="18"/>
-          <w:szCs w:val="18"/>
+          <w:sz w:val="22"/>
+          <w:szCs w:val="22"/>
         </w:rPr>
         <w:t xml:space="preserve">: </w:t>
       </w:r>
-      <w:r>
-        <w:rPr>
-          <w:rFonts w:asciiTheme="majorBidi" w:hAnsiTheme="majorBidi" w:cstheme="majorBidi"/>
-          <w:bCs/>
-          <w:sz w:val="18"/>
-          <w:szCs w:val="18"/>
-        </w:rPr>
-        <w:t>{{ ACTIVITES_INLINE }}</w:t>
-      </w:r>
-      <w:r>
-        <w:rPr>
-          <w:rFonts w:asciiTheme="majorBidi" w:hAnsiTheme="majorBidi" w:cstheme="majorBidi"/>
-          <w:bCs/>
-          <w:sz w:val="18"/>
-          <w:szCs w:val="18"/>
-        </w:rPr>
-        <w:t> ;</w:t>
-      </w:r>
-      <w:r>
-        <w:t xml:space="preserve"> </w:t>
-      </w:r>
-      <w:r>
-        <w:rPr>
-          <w:rFonts w:asciiTheme="majorBidi" w:hAnsiTheme="majorBidi" w:cstheme="majorBidi"/>
-          <w:bCs/>
-          <w:sz w:val="18"/>
-          <w:szCs w:val="18"/>
-        </w:rPr>
-        <w:t/>
-      </w:r>
-      <w:r>
-        <w:rPr>
-          <w:rFonts w:asciiTheme="majorBidi" w:hAnsiTheme="majorBidi" w:cstheme="majorBidi"/>
-          <w:bCs/>
-          <w:sz w:val="18"/>
-          <w:szCs w:val="18"/>
-        </w:rPr>
-        <w:t xml:space="preserve"> ; </w:t>
-      </w:r>
-      <w:r>
-        <w:rPr>
-          <w:rFonts w:asciiTheme="majorBidi" w:hAnsiTheme="majorBidi" w:cstheme="majorBidi"/>
-          <w:bCs/>
-          <w:sz w:val="18"/>
-          <w:szCs w:val="18"/>
-        </w:rPr>
-        <w:t/>
-      </w:r>
-      <w:r>
-        <w:rPr>
-          <w:rFonts w:asciiTheme="majorBidi" w:hAnsiTheme="majorBidi" w:cstheme="majorBidi"/>
-          <w:bCs/>
-          <w:sz w:val="18"/>
-          <w:szCs w:val="18"/>
-        </w:rPr>
-        <w:t> ;</w:t>
-      </w:r>
-      <w:r>
-        <w:t xml:space="preserve"> </w:t>
-      </w:r>
-      <w:r>
-        <w:rPr>
-          <w:rFonts w:asciiTheme="majorBidi" w:hAnsiTheme="majorBidi" w:cstheme="majorBidi"/>
-          <w:bCs/>
-          <w:sz w:val="18"/>
-          <w:szCs w:val="18"/>
-        </w:rPr>
-        <w:t/>
-      </w:r>
-      <w:r>
-        <w:rPr>
-          <w:rFonts w:asciiTheme="majorBidi" w:hAnsiTheme="majorBidi" w:cstheme="majorBidi"/>
-          <w:bCs/>
-          <w:sz w:val="18"/>
-          <w:szCs w:val="18"/>
-        </w:rPr>
-        <w:t> ;</w:t>
-      </w:r>
-      <w:r>
-        <w:t xml:space="preserve"> </w:t>
-      </w:r>
-      <w:r>
-        <w:rPr>
-          <w:rFonts w:asciiTheme="majorBidi" w:hAnsiTheme="majorBidi" w:cstheme="majorBidi"/>
-          <w:bCs/>
-          <w:sz w:val="18"/>
-          <w:szCs w:val="18"/>
-        </w:rPr>
-        <w:t/>
-      </w:r>
-      <w:r>
-        <w:rPr>
-          <w:rFonts w:asciiTheme="majorBidi" w:hAnsiTheme="majorBidi" w:cstheme="majorBidi"/>
-          <w:bCs/>
-          <w:sz w:val="18"/>
-          <w:szCs w:val="18"/>
-        </w:rPr>
-        <w:t> ;</w:t>
-      </w:r>
-      <w:r>
-        <w:t xml:space="preserve"> </w:t>
-      </w:r>
-      <w:r>
-        <w:rPr>
-          <w:rFonts w:asciiTheme="majorBidi" w:hAnsiTheme="majorBidi" w:cstheme="majorBidi"/>
-          <w:bCs/>
-          <w:sz w:val="18"/>
-          <w:szCs w:val="18"/>
-        </w:rPr>
-        <w:t/>
+      <w:proofErr w:type="gramStart"/>
+      <w:r>
+        <w:rPr>
+          <w:rFonts w:asciiTheme="majorBidi" w:hAnsiTheme="majorBidi" w:cstheme="majorBidi"/>
+          <w:bCs/>
+          <w:sz w:val="22"/>
+          <w:szCs w:val="22"/>
+        </w:rPr>
+        <w:t>{{ ACTIVITES</w:t>
+      </w:r>
+      <w:proofErr w:type="gramEnd"/>
+      <w:r>
+        <w:rPr>
+          <w:rFonts w:asciiTheme="majorBidi" w:hAnsiTheme="majorBidi" w:cstheme="majorBidi"/>
+          <w:bCs/>
+          <w:sz w:val="22"/>
+          <w:szCs w:val="22"/>
+        </w:rPr>
+        <w:t>_</w:t>
+      </w:r>
+      <w:proofErr w:type="gramStart"/>
+      <w:r>
+        <w:rPr>
+          <w:rFonts w:asciiTheme="majorBidi" w:hAnsiTheme="majorBidi" w:cstheme="majorBidi"/>
+          <w:bCs/>
+          <w:sz w:val="22"/>
+          <w:szCs w:val="22"/>
+        </w:rPr>
+        <w:t>INLINE }</w:t>
+      </w:r>
+      <w:proofErr w:type="gramEnd"/>
+      <w:r>
+        <w:rPr>
+          <w:rFonts w:asciiTheme="majorBidi" w:hAnsiTheme="majorBidi" w:cstheme="majorBidi"/>
+          <w:bCs/>
+          <w:sz w:val="22"/>
+          <w:szCs w:val="22"/>
+        </w:rPr>
+        <w:t>}</w:t>
       </w:r>
     </w:p>
     <w:p>
@@ -445,62 +513,80 @@
           <w:ilvl w:val="0"/>
           <w:numId w:val="10"/>
         </w:numPr>
+        <w:spacing w:line="360" w:lineRule="auto"/>
         <w:ind w:left="567"/>
         <w:jc w:val="both"/>
         <w:rPr>
           <w:rFonts w:asciiTheme="majorBidi" w:hAnsiTheme="majorBidi" w:cstheme="majorBidi"/>
           <w:bCs/>
-          <w:sz w:val="18"/>
-          <w:szCs w:val="18"/>
-        </w:rPr>
-      </w:pPr>
-      <w:r>
-        <w:rPr>
-          <w:rFonts w:asciiTheme="majorBidi" w:hAnsiTheme="majorBidi" w:cstheme="majorBidi"/>
-          <w:b/>
-          <w:sz w:val="18"/>
-          <w:szCs w:val="18"/>
+          <w:sz w:val="22"/>
+          <w:szCs w:val="22"/>
+        </w:rPr>
+      </w:pPr>
+      <w:r>
+        <w:rPr>
+          <w:rFonts w:asciiTheme="majorBidi" w:hAnsiTheme="majorBidi" w:cstheme="majorBidi"/>
+          <w:b/>
+          <w:sz w:val="22"/>
+          <w:szCs w:val="22"/>
         </w:rPr>
         <w:t>Siège Social :</w:t>
       </w:r>
       <w:r>
+        <w:rPr>
+          <w:sz w:val="32"/>
+          <w:szCs w:val="32"/>
+        </w:rPr>
         <w:t xml:space="preserve"> </w:t>
       </w:r>
-      <w:r>
-        <w:rPr>
-          <w:rFonts w:asciiTheme="majorBidi" w:hAnsiTheme="majorBidi" w:cstheme="majorBidi"/>
-          <w:bCs/>
-          <w:sz w:val="18"/>
-          <w:szCs w:val="18"/>
-        </w:rPr>
-        <w:t>{{ SOCIETE_ADRESSE_SIEGE }}</w:t>
-      </w:r>
-      <w:r>
-        <w:rPr>
-          <w:rFonts w:asciiTheme="majorBidi" w:hAnsiTheme="majorBidi" w:cstheme="majorBidi"/>
-          <w:bCs/>
-          <w:sz w:val="18"/>
-          <w:szCs w:val="18"/>
-        </w:rPr>
-        <w:t xml:space="preserve"> </w:t>
-      </w:r>
-      <w:r>
-        <w:rPr>
-          <w:rFonts w:asciiTheme="majorBidi" w:hAnsiTheme="majorBidi" w:cstheme="majorBidi"/>
-          <w:bCs/>
-          <w:sz w:val="18"/>
-          <w:szCs w:val="18"/>
-        </w:rPr>
-        <w:t>Casablanca</w:t>
-      </w:r>
-      <w:r>
-        <w:rPr>
-          <w:rFonts w:asciiTheme="majorBidi" w:hAnsiTheme="majorBidi" w:cstheme="majorBidi"/>
-          <w:bCs/>
-          <w:sz w:val="18"/>
-          <w:szCs w:val="18"/>
-        </w:rPr>
-        <w:t xml:space="preserve"> -Maroc </w:t>
+      <w:proofErr w:type="gramStart"/>
+      <w:r>
+        <w:rPr>
+          <w:rFonts w:asciiTheme="majorBidi" w:hAnsiTheme="majorBidi" w:cstheme="majorBidi"/>
+          <w:bCs/>
+          <w:sz w:val="22"/>
+          <w:szCs w:val="22"/>
+        </w:rPr>
+        <w:t>{{ SOCIETE</w:t>
+      </w:r>
+      <w:proofErr w:type="gramEnd"/>
+      <w:r>
+        <w:rPr>
+          <w:rFonts w:asciiTheme="majorBidi" w:hAnsiTheme="majorBidi" w:cstheme="majorBidi"/>
+          <w:bCs/>
+          <w:sz w:val="22"/>
+          <w:szCs w:val="22"/>
+        </w:rPr>
+        <w:t>_ADRESSE_</w:t>
+      </w:r>
+      <w:proofErr w:type="gramStart"/>
+      <w:r>
+        <w:rPr>
+          <w:rFonts w:asciiTheme="majorBidi" w:hAnsiTheme="majorBidi" w:cstheme="majorBidi"/>
+          <w:bCs/>
+          <w:sz w:val="22"/>
+          <w:szCs w:val="22"/>
+        </w:rPr>
+        <w:t>SIEGE }</w:t>
+      </w:r>
+      <w:proofErr w:type="gramEnd"/>
+      <w:r>
+        <w:rPr>
+          <w:rFonts w:asciiTheme="majorBidi" w:hAnsiTheme="majorBidi" w:cstheme="majorBidi"/>
+          <w:bCs/>
+          <w:sz w:val="22"/>
+          <w:szCs w:val="22"/>
+        </w:rPr>
+        <w:t xml:space="preserve">} </w:t>
+      </w:r>
+      <w:r>
+        <w:rPr>
+          <w:rFonts w:asciiTheme="majorBidi" w:hAnsiTheme="majorBidi" w:cstheme="majorBidi"/>
+          <w:bCs/>
+          <w:sz w:val="22"/>
+          <w:szCs w:val="22"/>
+        </w:rPr>
+        <w:t xml:space="preserve">-Maroc </w:t>
       </w:r>
     </w:p>
     <w:p>
@@ -510,21 +596,22 @@
           <w:ilvl w:val="0"/>
           <w:numId w:val="10"/>
         </w:numPr>
+        <w:spacing w:line="360" w:lineRule="auto"/>
         <w:ind w:left="567"/>
         <w:jc w:val="both"/>
         <w:rPr>
           <w:rFonts w:asciiTheme="majorBidi" w:hAnsiTheme="majorBidi" w:cstheme="majorBidi"/>
           <w:bCs/>
-          <w:sz w:val="18"/>
-          <w:szCs w:val="18"/>
-        </w:rPr>
-      </w:pPr>
-      <w:r>
-        <w:rPr>
-          <w:rFonts w:asciiTheme="majorBidi" w:hAnsiTheme="majorBidi" w:cstheme="majorBidi"/>
-          <w:b/>
-          <w:sz w:val="18"/>
-          <w:szCs w:val="18"/>
+          <w:sz w:val="22"/>
+          <w:szCs w:val="22"/>
+        </w:rPr>
+      </w:pPr>
+      <w:r>
+        <w:rPr>
+          <w:rFonts w:asciiTheme="majorBidi" w:hAnsiTheme="majorBidi" w:cstheme="majorBidi"/>
+          <w:b/>
+          <w:sz w:val="22"/>
+          <w:szCs w:val="22"/>
         </w:rPr>
         <w:t xml:space="preserve">Durée : </w:t>
       </w:r>
@@ -532,8 +619,8 @@
         <w:rPr>
           <w:rFonts w:asciiTheme="majorBidi" w:hAnsiTheme="majorBidi" w:cstheme="majorBidi"/>
           <w:bCs/>
-          <w:sz w:val="18"/>
-          <w:szCs w:val="18"/>
+          <w:sz w:val="22"/>
+          <w:szCs w:val="22"/>
         </w:rPr>
         <w:t>99 ans</w:t>
       </w:r>
@@ -541,8 +628,8 @@
         <w:rPr>
           <w:rFonts w:asciiTheme="majorBidi" w:hAnsiTheme="majorBidi" w:cstheme="majorBidi"/>
           <w:bCs/>
-          <w:sz w:val="18"/>
-          <w:szCs w:val="18"/>
+          <w:sz w:val="22"/>
+          <w:szCs w:val="22"/>
         </w:rPr>
         <w:t>.</w:t>
       </w:r>
@@ -554,446 +641,176 @@
           <w:ilvl w:val="0"/>
           <w:numId w:val="10"/>
         </w:numPr>
+        <w:spacing w:line="360" w:lineRule="auto"/>
         <w:ind w:left="567"/>
         <w:jc w:val="both"/>
         <w:rPr>
           <w:rFonts w:asciiTheme="majorBidi" w:hAnsiTheme="majorBidi" w:cstheme="majorBidi"/>
           <w:bCs/>
-          <w:sz w:val="18"/>
-          <w:szCs w:val="18"/>
-        </w:rPr>
-      </w:pPr>
-      <w:r>
-        <w:rPr>
-          <w:rFonts w:asciiTheme="majorBidi" w:hAnsiTheme="majorBidi" w:cstheme="majorBidi"/>
-          <w:b/>
-          <w:sz w:val="18"/>
-          <w:szCs w:val="18"/>
-        </w:rPr>
-        <w:t>Capital Social</w:t>
-      </w:r>
-      <w:r>
-        <w:rPr>
-          <w:rFonts w:asciiTheme="majorBidi" w:hAnsiTheme="majorBidi" w:cstheme="majorBidi"/>
-          <w:b/>
-          <w:sz w:val="18"/>
-          <w:szCs w:val="18"/>
-        </w:rPr>
-        <w:t xml:space="preserve"> : </w:t>
-      </w:r>
-      <w:r>
-        <w:rPr>
-          <w:rFonts w:asciiTheme="majorBidi" w:hAnsiTheme="majorBidi" w:cstheme="majorBidi"/>
-          <w:bCs/>
-          <w:sz w:val="18"/>
-          <w:szCs w:val="18"/>
-        </w:rPr>
-        <w:t xml:space="preserve">s'élève à </w:t>
-      </w:r>
-      <w:r>
-        <w:rPr>
-          <w:rFonts w:asciiTheme="majorBidi" w:hAnsiTheme="majorBidi" w:cstheme="majorBidi"/>
-          <w:bCs/>
-          <w:sz w:val="18"/>
-          <w:szCs w:val="18"/>
-        </w:rPr>
-        <w:t>{{ SOCIETE_CAPITAL }}</w:t>
-      </w:r>
-      <w:r>
-        <w:rPr>
-          <w:rFonts w:asciiTheme="majorBidi" w:hAnsiTheme="majorBidi" w:cstheme="majorBidi"/>
-          <w:bCs/>
-          <w:sz w:val="18"/>
-          <w:szCs w:val="18"/>
-        </w:rPr>
-        <w:t>.00</w:t>
-      </w:r>
-      <w:r>
-        <w:rPr>
-          <w:rFonts w:asciiTheme="majorBidi" w:hAnsiTheme="majorBidi" w:cstheme="majorBidi"/>
-          <w:bCs/>
-          <w:sz w:val="18"/>
-          <w:szCs w:val="18"/>
-        </w:rPr>
-        <w:t xml:space="preserve"> </w:t>
-      </w:r>
-      <w:proofErr w:type="spellStart"/>
-      <w:r>
-        <w:rPr>
-          <w:rFonts w:asciiTheme="majorBidi" w:hAnsiTheme="majorBidi" w:cstheme="majorBidi"/>
-          <w:bCs/>
-          <w:sz w:val="18"/>
-          <w:szCs w:val="18"/>
-        </w:rPr>
-        <w:t>Dhs</w:t>
-      </w:r>
-      <w:proofErr w:type="spellEnd"/>
-      <w:r>
-        <w:rPr>
-          <w:rFonts w:asciiTheme="majorBidi" w:hAnsiTheme="majorBidi" w:cstheme="majorBidi"/>
-          <w:bCs/>
-          <w:sz w:val="18"/>
-          <w:szCs w:val="18"/>
-        </w:rPr>
-        <w:t xml:space="preserve"> divisé en </w:t>
-      </w:r>
-      <w:r>
-        <w:rPr>
-          <w:rFonts w:asciiTheme="majorBidi" w:hAnsiTheme="majorBidi" w:cstheme="majorBidi"/>
-          <w:bCs/>
-          <w:sz w:val="18"/>
-          <w:szCs w:val="18"/>
-        </w:rPr>
-        <w:t>{{ SOCIETE_PART_SOCIAL }}</w:t>
-      </w:r>
-      <w:r>
-        <w:rPr>
-          <w:rFonts w:asciiTheme="majorBidi" w:hAnsiTheme="majorBidi" w:cstheme="majorBidi"/>
-          <w:bCs/>
-          <w:sz w:val="18"/>
-          <w:szCs w:val="18"/>
-        </w:rPr>
-        <w:t xml:space="preserve"> </w:t>
-      </w:r>
-      <w:r>
-        <w:rPr>
-          <w:rFonts w:asciiTheme="majorBidi" w:hAnsiTheme="majorBidi" w:cstheme="majorBidi"/>
-          <w:bCs/>
-          <w:sz w:val="18"/>
-          <w:szCs w:val="18"/>
-        </w:rPr>
-        <w:t>parts sociales de </w:t>
-      </w:r>
-      <w:r>
-        <w:rPr>
-          <w:rFonts w:asciiTheme="majorBidi" w:hAnsiTheme="majorBidi" w:cstheme="majorBidi"/>
-          <w:bCs/>
-          <w:sz w:val="18"/>
-          <w:szCs w:val="18"/>
-        </w:rPr>
-        <w:t>100</w:t>
-      </w:r>
-      <w:r>
-        <w:rPr>
-          <w:rFonts w:asciiTheme="majorBidi" w:hAnsiTheme="majorBidi" w:cstheme="majorBidi"/>
-          <w:bCs/>
-          <w:sz w:val="18"/>
-          <w:szCs w:val="18"/>
-        </w:rPr>
-        <w:t xml:space="preserve"> DH chacune, attribuées </w:t>
-      </w:r>
-      <w:r>
-        <w:rPr>
-          <w:rFonts w:asciiTheme="majorBidi" w:hAnsiTheme="majorBidi" w:cstheme="majorBidi"/>
-          <w:bCs/>
-          <w:sz w:val="18"/>
-          <w:szCs w:val="18"/>
-        </w:rPr>
-        <w:t>à</w:t>
-      </w:r>
-      <w:r>
-        <w:rPr>
-          <w:rFonts w:asciiTheme="majorBidi" w:hAnsiTheme="majorBidi" w:cstheme="majorBidi"/>
-          <w:bCs/>
-          <w:sz w:val="18"/>
-          <w:szCs w:val="18"/>
-        </w:rPr>
-        <w:t xml:space="preserve"> </w:t>
-      </w:r>
-      <w:r>
-        <w:rPr>
-          <w:rFonts w:asciiTheme="majorBidi" w:hAnsiTheme="majorBidi" w:cstheme="majorBidi"/>
-          <w:bCs/>
-          <w:sz w:val="18"/>
-          <w:szCs w:val="18"/>
-        </w:rPr>
-        <w:t>l’</w:t>
-      </w:r>
-      <w:r>
-        <w:rPr>
-          <w:rFonts w:asciiTheme="majorBidi" w:hAnsiTheme="majorBidi" w:cstheme="majorBidi"/>
-          <w:bCs/>
-          <w:sz w:val="18"/>
-          <w:szCs w:val="18"/>
-        </w:rPr>
-        <w:t>associé</w:t>
-      </w:r>
-      <w:r>
-        <w:rPr>
-          <w:rFonts w:asciiTheme="majorBidi" w:hAnsiTheme="majorBidi" w:cstheme="majorBidi"/>
-          <w:bCs/>
-          <w:sz w:val="18"/>
-          <w:szCs w:val="18"/>
-        </w:rPr>
-        <w:t xml:space="preserve"> unique :</w:t>
-      </w:r>
-      <w:r>
-        <w:rPr>
-          <w:rFonts w:asciiTheme="majorBidi" w:hAnsiTheme="majorBidi" w:cstheme="majorBidi"/>
-          <w:bCs/>
-          <w:sz w:val="18"/>
-          <w:szCs w:val="18"/>
-        </w:rPr>
-        <w:t xml:space="preserve"> </w:t>
-      </w:r>
-      <w:r>
-        <w:rPr>
-          <w:rFonts w:asciiTheme="majorBidi" w:hAnsiTheme="majorBidi" w:cstheme="majorBidi"/>
-          <w:sz w:val="18"/>
-          <w:szCs w:val="18"/>
-          <w:lang w:val="fr-CA"/>
-        </w:rPr>
-        <w:t xml:space="preserve">                              </w:t>
-      </w:r>
-      <w:r>
-        <w:rPr>
-          <w:rFonts w:asciiTheme="majorBidi" w:hAnsiTheme="majorBidi" w:cstheme="majorBidi"/>
-          <w:sz w:val="18"/>
-          <w:szCs w:val="18"/>
-          <w:lang w:val="fr-CA"/>
-        </w:rPr>
-        <w:t xml:space="preserve">                             </w:t>
+          <w:sz w:val="22"/>
+          <w:szCs w:val="22"/>
+        </w:rPr>
+      </w:pPr>
+      <w:r>
+        <w:rPr>
+          <w:rFonts w:asciiTheme="majorBidi" w:hAnsiTheme="majorBidi" w:cstheme="majorBidi"/>
+          <w:b/>
+          <w:sz w:val="22"/>
+          <w:szCs w:val="22"/>
+        </w:rPr>
+        <w:t xml:space="preserve">Capital Social : s'élève à </w:t>
+      </w:r>
+      <w:proofErr w:type="gramStart"/>
+      <w:r>
+        <w:rPr>
+          <w:rFonts w:asciiTheme="majorBidi" w:hAnsiTheme="majorBidi" w:cstheme="majorBidi"/>
+          <w:b/>
+          <w:sz w:val="22"/>
+          <w:szCs w:val="22"/>
+        </w:rPr>
+        <w:t>{{ SOCIETE</w:t>
+      </w:r>
+      <w:proofErr w:type="gramEnd"/>
+      <w:r>
+        <w:rPr>
+          <w:rFonts w:asciiTheme="majorBidi" w:hAnsiTheme="majorBidi" w:cstheme="majorBidi"/>
+          <w:b/>
+          <w:sz w:val="22"/>
+          <w:szCs w:val="22"/>
+        </w:rPr>
+        <w:t>_</w:t>
+      </w:r>
+      <w:proofErr w:type="gramStart"/>
+      <w:r>
+        <w:rPr>
+          <w:rFonts w:asciiTheme="majorBidi" w:hAnsiTheme="majorBidi" w:cstheme="majorBidi"/>
+          <w:b/>
+          <w:sz w:val="22"/>
+          <w:szCs w:val="22"/>
+        </w:rPr>
+        <w:t>CAPITAL }</w:t>
+      </w:r>
+      <w:proofErr w:type="gramEnd"/>
+      <w:r>
+        <w:rPr>
+          <w:rFonts w:asciiTheme="majorBidi" w:hAnsiTheme="majorBidi" w:cstheme="majorBidi"/>
+          <w:b/>
+          <w:sz w:val="22"/>
+          <w:szCs w:val="22"/>
+        </w:rPr>
+        <w:t xml:space="preserve">} Dhs divisé en </w:t>
+      </w:r>
+      <w:proofErr w:type="gramStart"/>
+      <w:r>
+        <w:rPr>
+          <w:rFonts w:asciiTheme="majorBidi" w:hAnsiTheme="majorBidi" w:cstheme="majorBidi"/>
+          <w:b/>
+          <w:sz w:val="22"/>
+          <w:szCs w:val="22"/>
+        </w:rPr>
+        <w:t>{{ SOCIETE</w:t>
+      </w:r>
+      <w:proofErr w:type="gramEnd"/>
+      <w:r>
+        <w:rPr>
+          <w:rFonts w:asciiTheme="majorBidi" w:hAnsiTheme="majorBidi" w:cstheme="majorBidi"/>
+          <w:b/>
+          <w:sz w:val="22"/>
+          <w:szCs w:val="22"/>
+        </w:rPr>
+        <w:t>_PART_</w:t>
+      </w:r>
+      <w:proofErr w:type="gramStart"/>
+      <w:r>
+        <w:rPr>
+          <w:rFonts w:asciiTheme="majorBidi" w:hAnsiTheme="majorBidi" w:cstheme="majorBidi"/>
+          <w:b/>
+          <w:sz w:val="22"/>
+          <w:szCs w:val="22"/>
+        </w:rPr>
+        <w:t>SOCIAL }</w:t>
+      </w:r>
+      <w:proofErr w:type="gramEnd"/>
+      <w:r>
+        <w:rPr>
+          <w:rFonts w:asciiTheme="majorBidi" w:hAnsiTheme="majorBidi" w:cstheme="majorBidi"/>
+          <w:b/>
+          <w:sz w:val="22"/>
+          <w:szCs w:val="22"/>
+        </w:rPr>
+        <w:t xml:space="preserve">} parts sociales </w:t>
+      </w:r>
+      <w:r>
+        <w:rPr>
+          <w:rFonts w:asciiTheme="majorBidi" w:hAnsiTheme="majorBidi" w:cstheme="majorBidi"/>
+          <w:b/>
+          <w:sz w:val="22"/>
+          <w:szCs w:val="22"/>
+        </w:rPr>
+        <w:t xml:space="preserve">de </w:t>
+      </w:r>
+      <w:proofErr w:type="gramStart"/>
+      <w:r>
+        <w:rPr>
+          <w:rFonts w:asciiTheme="majorBidi" w:hAnsiTheme="majorBidi" w:cstheme="majorBidi"/>
+          <w:b/>
+          <w:sz w:val="22"/>
+          <w:szCs w:val="22"/>
+        </w:rPr>
+        <w:t>{{ SOCIETE</w:t>
+      </w:r>
+      <w:proofErr w:type="gramEnd"/>
+      <w:r>
+        <w:rPr>
+          <w:rFonts w:asciiTheme="majorBidi" w:hAnsiTheme="majorBidi" w:cstheme="majorBidi"/>
+          <w:b/>
+          <w:sz w:val="22"/>
+          <w:szCs w:val="22"/>
+        </w:rPr>
+        <w:t>_VALEUR_</w:t>
+      </w:r>
+      <w:proofErr w:type="gramStart"/>
+      <w:r>
+        <w:rPr>
+          <w:rFonts w:asciiTheme="majorBidi" w:hAnsiTheme="majorBidi" w:cstheme="majorBidi"/>
+          <w:b/>
+          <w:sz w:val="22"/>
+          <w:szCs w:val="22"/>
+        </w:rPr>
+        <w:t>NOMINALE }</w:t>
+      </w:r>
+      <w:proofErr w:type="gramEnd"/>
+      <w:r>
+        <w:rPr>
+          <w:rFonts w:asciiTheme="majorBidi" w:hAnsiTheme="majorBidi" w:cstheme="majorBidi"/>
+          <w:b/>
+          <w:sz w:val="22"/>
+          <w:szCs w:val="22"/>
+        </w:rPr>
+        <w:t>} DH chacune, attribuées aux associés :</w:t>
       </w:r>
     </w:p>
     <w:p>
       <w:pPr>
-        <w:ind w:left="207" w:firstLine="360"/>
+        <w:spacing w:line="360" w:lineRule="auto"/>
         <w:jc w:val="both"/>
         <w:rPr>
           <w:rFonts w:asciiTheme="majorBidi" w:hAnsiTheme="majorBidi" w:cstheme="majorBidi"/>
           <w:b/>
-          <w:sz w:val="18"/>
-          <w:szCs w:val="18"/>
-        </w:rPr>
-      </w:pPr>
-      <w:r>
-        <w:rPr>
-          <w:rFonts w:asciiTheme="majorBidi" w:hAnsiTheme="majorBidi" w:cstheme="majorBidi"/>
-          <w:b/>
-          <w:sz w:val="18"/>
-          <w:szCs w:val="18"/>
-        </w:rPr>
-        <w:t>{{ ASSOCIE_CIVILITE }}</w:t>
-      </w:r>
-      <w:r>
-        <w:rPr>
-          <w:rFonts w:asciiTheme="majorBidi" w:hAnsiTheme="majorBidi" w:cstheme="majorBidi"/>
-          <w:b/>
-          <w:sz w:val="18"/>
-          <w:szCs w:val="18"/>
-        </w:rPr>
-        <w:t xml:space="preserve"> </w:t>
-      </w:r>
-      <w:r>
-        <w:rPr>
-          <w:rFonts w:asciiTheme="majorBidi" w:hAnsiTheme="majorBidi" w:cstheme="majorBidi"/>
-          <w:b/>
-          <w:sz w:val="18"/>
-          <w:szCs w:val="18"/>
-        </w:rPr>
-        <w:t>{{ ASSOCIE_PRENOM }}</w:t>
-      </w:r>
-      <w:r>
-        <w:rPr>
-          <w:rFonts w:asciiTheme="majorBidi" w:hAnsiTheme="majorBidi" w:cstheme="majorBidi"/>
-          <w:b/>
-          <w:sz w:val="18"/>
-          <w:szCs w:val="18"/>
-        </w:rPr>
-        <w:t xml:space="preserve"> </w:t>
-      </w:r>
-      <w:r>
-        <w:rPr>
-          <w:rFonts w:asciiTheme="majorBidi" w:hAnsiTheme="majorBidi" w:cstheme="majorBidi"/>
-          <w:b/>
-          <w:sz w:val="18"/>
-          <w:szCs w:val="18"/>
-        </w:rPr>
-        <w:t>{{ ASSOCIE_NOM }}</w:t>
-      </w:r>
-      <w:r>
-        <w:rPr>
-          <w:rFonts w:asciiTheme="majorBidi" w:hAnsiTheme="majorBidi" w:cstheme="majorBidi"/>
-          <w:b/>
-          <w:sz w:val="18"/>
-          <w:szCs w:val="18"/>
-        </w:rPr>
-        <w:t xml:space="preserve"> </w:t>
-      </w:r>
-      <w:r>
-        <w:rPr>
-          <w:rFonts w:asciiTheme="majorBidi" w:hAnsiTheme="majorBidi" w:cstheme="majorBidi"/>
-          <w:b/>
-          <w:sz w:val="18"/>
-          <w:szCs w:val="18"/>
-        </w:rPr>
-        <w:t>-----------------------------</w:t>
-      </w:r>
-      <w:r>
-        <w:rPr>
-          <w:rFonts w:asciiTheme="majorBidi" w:hAnsiTheme="majorBidi" w:cstheme="majorBidi"/>
-          <w:b/>
-          <w:sz w:val="18"/>
-          <w:szCs w:val="18"/>
-        </w:rPr>
-        <w:t>-</w:t>
-      </w:r>
-      <w:r>
-        <w:rPr>
-          <w:rFonts w:asciiTheme="majorBidi" w:hAnsiTheme="majorBidi" w:cstheme="majorBidi"/>
-          <w:b/>
-          <w:sz w:val="18"/>
-          <w:szCs w:val="18"/>
-        </w:rPr>
-        <w:t>------------</w:t>
-      </w:r>
-      <w:r>
-        <w:rPr>
-          <w:rFonts w:asciiTheme="majorBidi" w:hAnsiTheme="majorBidi" w:cstheme="majorBidi"/>
-          <w:b/>
-          <w:sz w:val="18"/>
-          <w:szCs w:val="18"/>
-        </w:rPr>
-        <w:t>--------</w:t>
-      </w:r>
-      <w:r>
-        <w:rPr>
-          <w:rFonts w:asciiTheme="majorBidi" w:hAnsiTheme="majorBidi" w:cstheme="majorBidi"/>
-          <w:b/>
-          <w:sz w:val="18"/>
-          <w:szCs w:val="18"/>
-        </w:rPr>
-        <w:t>------</w:t>
-      </w:r>
-      <w:r>
-        <w:rPr>
-          <w:rFonts w:asciiTheme="majorBidi" w:hAnsiTheme="majorBidi" w:cstheme="majorBidi"/>
-          <w:b/>
-          <w:sz w:val="18"/>
-          <w:szCs w:val="18"/>
-        </w:rPr>
-        <w:t>{{ SOCIETE_PART_SOCIAL }}</w:t>
-      </w:r>
-      <w:r>
-        <w:rPr>
-          <w:rFonts w:asciiTheme="majorBidi" w:hAnsiTheme="majorBidi" w:cstheme="majorBidi"/>
-          <w:b/>
-          <w:sz w:val="18"/>
-          <w:szCs w:val="18"/>
-        </w:rPr>
-        <w:t xml:space="preserve"> </w:t>
-      </w:r>
-      <w:r>
-        <w:rPr>
-          <w:rFonts w:asciiTheme="majorBidi" w:hAnsiTheme="majorBidi" w:cstheme="majorBidi"/>
-          <w:b/>
-          <w:sz w:val="18"/>
-          <w:szCs w:val="18"/>
-        </w:rPr>
-        <w:t xml:space="preserve">Parts    </w:t>
-      </w:r>
-    </w:p>
-    <w:p>
-      <w:pPr>
-        <w:pStyle w:val="Paragraphedeliste"/>
-        <w:ind w:left="567"/>
-        <w:jc w:val="both"/>
-        <w:rPr>
-          <w:rFonts w:asciiTheme="majorBidi" w:hAnsiTheme="majorBidi" w:cstheme="majorBidi"/>
-          <w:b/>
-          <w:sz w:val="18"/>
-          <w:szCs w:val="18"/>
-        </w:rPr>
-      </w:pPr>
-      <w:r>
-        <w:rPr>
-          <w:rFonts w:asciiTheme="majorBidi" w:hAnsiTheme="majorBidi" w:cstheme="majorBidi"/>
-          <w:b/>
-          <w:sz w:val="18"/>
-          <w:szCs w:val="18"/>
-        </w:rPr>
-        <w:t>Total----------------------------------------------------------------------</w:t>
-      </w:r>
-      <w:r>
-        <w:rPr>
-          <w:rFonts w:asciiTheme="majorBidi" w:hAnsiTheme="majorBidi" w:cstheme="majorBidi"/>
-          <w:b/>
-          <w:sz w:val="18"/>
-          <w:szCs w:val="18"/>
-        </w:rPr>
-        <w:t>---</w:t>
-      </w:r>
-      <w:r>
-        <w:rPr>
-          <w:rFonts w:asciiTheme="majorBidi" w:hAnsiTheme="majorBidi" w:cstheme="majorBidi"/>
-          <w:b/>
-          <w:sz w:val="18"/>
-          <w:szCs w:val="18"/>
-        </w:rPr>
-        <w:t>-</w:t>
-      </w:r>
-      <w:r>
-        <w:rPr>
-          <w:rFonts w:asciiTheme="majorBidi" w:hAnsiTheme="majorBidi" w:cstheme="majorBidi"/>
-          <w:b/>
-          <w:sz w:val="18"/>
-          <w:szCs w:val="18"/>
-        </w:rPr>
-        <w:t>---</w:t>
-      </w:r>
-      <w:r>
-        <w:rPr>
-          <w:rFonts w:asciiTheme="majorBidi" w:hAnsiTheme="majorBidi" w:cstheme="majorBidi"/>
-          <w:b/>
-          <w:sz w:val="18"/>
-          <w:szCs w:val="18"/>
-        </w:rPr>
-        <w:t>-</w:t>
-      </w:r>
-      <w:r>
-        <w:rPr>
-          <w:rFonts w:asciiTheme="majorBidi" w:hAnsiTheme="majorBidi" w:cstheme="majorBidi"/>
-          <w:b/>
-          <w:sz w:val="18"/>
-          <w:szCs w:val="18"/>
-        </w:rPr>
-        <w:t>----</w:t>
-      </w:r>
-      <w:r>
-        <w:rPr>
-          <w:rFonts w:asciiTheme="majorBidi" w:hAnsiTheme="majorBidi" w:cstheme="majorBidi"/>
-          <w:b/>
-          <w:sz w:val="18"/>
-          <w:szCs w:val="18"/>
-        </w:rPr>
-        <w:t>-</w:t>
-      </w:r>
-      <w:r>
-        <w:rPr>
-          <w:rFonts w:asciiTheme="majorBidi" w:hAnsiTheme="majorBidi" w:cstheme="majorBidi"/>
-          <w:b/>
-          <w:sz w:val="18"/>
-          <w:szCs w:val="18"/>
-        </w:rPr>
-        <w:t>{{ SOCIETE_PART_SOCIAL }}</w:t>
-      </w:r>
-      <w:r>
-        <w:rPr>
-          <w:rFonts w:asciiTheme="majorBidi" w:hAnsiTheme="majorBidi" w:cstheme="majorBidi"/>
-          <w:b/>
-          <w:sz w:val="18"/>
-          <w:szCs w:val="18"/>
-        </w:rPr>
-        <w:t xml:space="preserve"> </w:t>
-      </w:r>
-      <w:r>
-        <w:rPr>
-          <w:rFonts w:asciiTheme="majorBidi" w:hAnsiTheme="majorBidi" w:cstheme="majorBidi"/>
-          <w:b/>
-          <w:sz w:val="18"/>
-          <w:szCs w:val="18"/>
-        </w:rPr>
-        <w:t>Parts</w:t>
+          <w:sz w:val="22"/>
+          <w:szCs w:val="22"/>
+          <w:lang w:val="en-US"/>
+        </w:rPr>
+      </w:pPr>
+      <w:r>
+        <w:rPr>
+          <w:rFonts w:asciiTheme="majorBidi" w:hAnsiTheme="majorBidi" w:cstheme="majorBidi"/>
+          <w:b/>
+          <w:sz w:val="22"/>
+          <w:szCs w:val="22"/>
+          <w:lang w:val="en-US"/>
+        </w:rPr>
+        <w:t>{%p for a in associes %}</w:t>
       </w:r>
     </w:p>
     <w:p>
@@ -1003,95 +820,303 @@
           <w:ilvl w:val="0"/>
           <w:numId w:val="10"/>
         </w:numPr>
-        <w:ind w:left="567"/>
+        <w:spacing w:line="360" w:lineRule="auto"/>
         <w:jc w:val="both"/>
         <w:rPr>
           <w:rFonts w:asciiTheme="majorBidi" w:hAnsiTheme="majorBidi" w:cstheme="majorBidi"/>
-          <w:bCs/>
-          <w:sz w:val="18"/>
-          <w:szCs w:val="18"/>
-        </w:rPr>
-      </w:pPr>
-      <w:r>
-        <w:rPr>
-          <w:rFonts w:asciiTheme="majorBidi" w:hAnsiTheme="majorBidi" w:cstheme="majorBidi"/>
-          <w:b/>
-          <w:sz w:val="18"/>
-          <w:szCs w:val="18"/>
-        </w:rPr>
-        <w:t>Gérance</w:t>
-      </w:r>
-      <w:r>
-        <w:rPr>
-          <w:rFonts w:asciiTheme="majorBidi" w:hAnsiTheme="majorBidi" w:cstheme="majorBidi"/>
-          <w:b/>
-          <w:sz w:val="18"/>
-          <w:szCs w:val="18"/>
-        </w:rPr>
-        <w:t xml:space="preserve"> </w:t>
-      </w:r>
-      <w:r>
-        <w:rPr>
-          <w:rFonts w:asciiTheme="majorBidi" w:hAnsiTheme="majorBidi" w:cstheme="majorBidi"/>
-          <w:b/>
-          <w:sz w:val="18"/>
-          <w:szCs w:val="18"/>
-        </w:rPr>
-        <w:t>:</w:t>
-      </w:r>
-      <w:r>
-        <w:rPr>
-          <w:rFonts w:asciiTheme="majorBidi" w:hAnsiTheme="majorBidi" w:cstheme="majorBidi"/>
-          <w:b/>
-          <w:sz w:val="18"/>
-          <w:szCs w:val="18"/>
-        </w:rPr>
-        <w:t xml:space="preserve"> </w:t>
-      </w:r>
-      <w:r>
-        <w:rPr>
-          <w:rFonts w:asciiTheme="majorBidi" w:hAnsiTheme="majorBidi" w:cstheme="majorBidi"/>
-          <w:bCs/>
-          <w:sz w:val="18"/>
-          <w:szCs w:val="18"/>
-        </w:rPr>
-        <w:t>La société sera gérée par</w:t>
-      </w:r>
-      <w:r>
-        <w:rPr>
-          <w:rFonts w:asciiTheme="majorBidi" w:hAnsiTheme="majorBidi" w:cstheme="majorBidi"/>
-          <w:bCs/>
-          <w:sz w:val="18"/>
-          <w:szCs w:val="18"/>
-        </w:rPr>
-        <w:t xml:space="preserve"> </w:t>
-      </w:r>
-      <w:r>
-        <w:rPr>
-          <w:rFonts w:asciiTheme="majorBidi" w:hAnsiTheme="majorBidi" w:cstheme="majorBidi"/>
-          <w:b/>
-          <w:sz w:val="18"/>
-          <w:szCs w:val="18"/>
-        </w:rPr>
-        <w:t>{{ ASSOCIE_CIVILITE }} {{ ASSOCIE_PRENOM }} {{ ASSOCIE_NOM }}</w:t>
-      </w:r>
-      <w:r>
-        <w:rPr>
-          <w:rFonts w:asciiTheme="majorBidi" w:hAnsiTheme="majorBidi" w:cstheme="majorBidi"/>
-          <w:b/>
-          <w:sz w:val="18"/>
-          <w:szCs w:val="18"/>
+          <w:b/>
+          <w:sz w:val="22"/>
+          <w:szCs w:val="22"/>
+        </w:rPr>
+      </w:pPr>
+      <w:proofErr w:type="gramStart"/>
+      <w:r>
+        <w:rPr>
+          <w:rFonts w:asciiTheme="majorBidi" w:hAnsiTheme="majorBidi" w:cstheme="majorBidi"/>
+          <w:b/>
+          <w:sz w:val="22"/>
+          <w:szCs w:val="22"/>
+        </w:rPr>
+        <w:t xml:space="preserve">{{ </w:t>
+      </w:r>
+      <w:proofErr w:type="spellStart"/>
+      <w:r>
+        <w:rPr>
+          <w:rFonts w:asciiTheme="majorBidi" w:hAnsiTheme="majorBidi" w:cstheme="majorBidi"/>
+          <w:b/>
+          <w:sz w:val="22"/>
+          <w:szCs w:val="22"/>
+        </w:rPr>
+        <w:t>a.NOM</w:t>
+      </w:r>
+      <w:proofErr w:type="gramEnd"/>
+      <w:r>
+        <w:rPr>
+          <w:rFonts w:asciiTheme="majorBidi" w:hAnsiTheme="majorBidi" w:cstheme="majorBidi"/>
+          <w:b/>
+          <w:sz w:val="22"/>
+          <w:szCs w:val="22"/>
+        </w:rPr>
+        <w:t>_</w:t>
+      </w:r>
+      <w:proofErr w:type="gramStart"/>
+      <w:r>
+        <w:rPr>
+          <w:rFonts w:asciiTheme="majorBidi" w:hAnsiTheme="majorBidi" w:cstheme="majorBidi"/>
+          <w:b/>
+          <w:sz w:val="22"/>
+          <w:szCs w:val="22"/>
+        </w:rPr>
+        <w:t>COMPLET</w:t>
+      </w:r>
+      <w:proofErr w:type="spellEnd"/>
+      <w:r>
+        <w:rPr>
+          <w:rFonts w:asciiTheme="majorBidi" w:hAnsiTheme="majorBidi" w:cstheme="majorBidi"/>
+          <w:b/>
+          <w:sz w:val="22"/>
+          <w:szCs w:val="22"/>
+        </w:rPr>
+        <w:t xml:space="preserve"> }</w:t>
+      </w:r>
+      <w:proofErr w:type="gramEnd"/>
+      <w:r>
+        <w:rPr>
+          <w:rFonts w:asciiTheme="majorBidi" w:hAnsiTheme="majorBidi" w:cstheme="majorBidi"/>
+          <w:b/>
+          <w:sz w:val="22"/>
+          <w:szCs w:val="22"/>
+        </w:rPr>
+        <w:t>}  ------------------------------------------------</w:t>
+      </w:r>
+      <w:proofErr w:type="gramStart"/>
+      <w:r>
+        <w:rPr>
+          <w:rFonts w:asciiTheme="majorBidi" w:hAnsiTheme="majorBidi" w:cstheme="majorBidi"/>
+          <w:b/>
+          <w:sz w:val="22"/>
+          <w:szCs w:val="22"/>
+        </w:rPr>
+        <w:t xml:space="preserve">{{ </w:t>
+      </w:r>
+      <w:proofErr w:type="spellStart"/>
+      <w:r>
+        <w:rPr>
+          <w:rFonts w:asciiTheme="majorBidi" w:hAnsiTheme="majorBidi" w:cstheme="majorBidi"/>
+          <w:b/>
+          <w:sz w:val="22"/>
+          <w:szCs w:val="22"/>
+        </w:rPr>
+        <w:t>a</w:t>
+      </w:r>
+      <w:proofErr w:type="gramEnd"/>
+      <w:r>
+        <w:rPr>
+          <w:rFonts w:asciiTheme="majorBidi" w:hAnsiTheme="majorBidi" w:cstheme="majorBidi"/>
+          <w:b/>
+          <w:sz w:val="22"/>
+          <w:szCs w:val="22"/>
         </w:rPr>
         <w:t>.</w:t>
       </w:r>
-      <w:r>
-        <w:rPr>
-          <w:rFonts w:asciiTheme="majorBidi" w:hAnsiTheme="majorBidi" w:cstheme="majorBidi"/>
-          <w:b/>
-          <w:sz w:val="18"/>
-          <w:szCs w:val="18"/>
-        </w:rPr>
-        <w:t xml:space="preserve"> </w:t>
+      <w:proofErr w:type="gramStart"/>
+      <w:r>
+        <w:rPr>
+          <w:rFonts w:asciiTheme="majorBidi" w:hAnsiTheme="majorBidi" w:cstheme="majorBidi"/>
+          <w:b/>
+          <w:sz w:val="22"/>
+          <w:szCs w:val="22"/>
+        </w:rPr>
+        <w:t>PARTS</w:t>
+      </w:r>
+      <w:proofErr w:type="spellEnd"/>
+      <w:r>
+        <w:rPr>
+          <w:rFonts w:asciiTheme="majorBidi" w:hAnsiTheme="majorBidi" w:cstheme="majorBidi"/>
+          <w:b/>
+          <w:sz w:val="22"/>
+          <w:szCs w:val="22"/>
+        </w:rPr>
+        <w:t xml:space="preserve"> }</w:t>
+      </w:r>
+      <w:proofErr w:type="gramEnd"/>
+      <w:r>
+        <w:rPr>
+          <w:rFonts w:asciiTheme="majorBidi" w:hAnsiTheme="majorBidi" w:cstheme="majorBidi"/>
+          <w:b/>
+          <w:sz w:val="22"/>
+          <w:szCs w:val="22"/>
+        </w:rPr>
+        <w:t>} Parts</w:t>
+      </w:r>
+    </w:p>
+    <w:p>
+      <w:pPr>
+        <w:spacing w:line="360" w:lineRule="auto"/>
+        <w:jc w:val="both"/>
+        <w:rPr>
+          <w:rFonts w:asciiTheme="majorBidi" w:hAnsiTheme="majorBidi" w:cstheme="majorBidi"/>
+          <w:b/>
+          <w:sz w:val="22"/>
+          <w:szCs w:val="22"/>
+        </w:rPr>
+      </w:pPr>
+      <w:r>
+        <w:rPr>
+          <w:rFonts w:asciiTheme="majorBidi" w:hAnsiTheme="majorBidi" w:cstheme="majorBidi"/>
+          <w:b/>
+          <w:sz w:val="22"/>
+          <w:szCs w:val="22"/>
+        </w:rPr>
+        <w:t xml:space="preserve">{%p </w:t>
+      </w:r>
+      <w:proofErr w:type="spellStart"/>
+      <w:r>
+        <w:rPr>
+          <w:rFonts w:asciiTheme="majorBidi" w:hAnsiTheme="majorBidi" w:cstheme="majorBidi"/>
+          <w:b/>
+          <w:sz w:val="22"/>
+          <w:szCs w:val="22"/>
+        </w:rPr>
+        <w:t>endfor</w:t>
+      </w:r>
+      <w:proofErr w:type="spellEnd"/>
+      <w:r>
+        <w:rPr>
+          <w:rFonts w:asciiTheme="majorBidi" w:hAnsiTheme="majorBidi" w:cstheme="majorBidi"/>
+          <w:b/>
+          <w:sz w:val="22"/>
+          <w:szCs w:val="22"/>
+        </w:rPr>
+        <w:t xml:space="preserve"> %}</w:t>
+      </w:r>
+    </w:p>
+    <w:p>
+      <w:pPr>
+        <w:spacing w:line="360" w:lineRule="auto"/>
+        <w:ind w:left="426"/>
+        <w:jc w:val="both"/>
+        <w:rPr>
+          <w:rFonts w:asciiTheme="majorBidi" w:hAnsiTheme="majorBidi" w:cstheme="majorBidi"/>
+          <w:b/>
+          <w:sz w:val="22"/>
+          <w:szCs w:val="22"/>
+        </w:rPr>
+      </w:pPr>
+      <w:r>
+        <w:rPr>
+          <w:rFonts w:asciiTheme="majorBidi" w:hAnsiTheme="majorBidi" w:cstheme="majorBidi"/>
+          <w:b/>
+          <w:sz w:val="22"/>
+          <w:szCs w:val="22"/>
+        </w:rPr>
+        <w:t>Total -----------------------------------------------------------------------------------</w:t>
+      </w:r>
+      <w:proofErr w:type="gramStart"/>
+      <w:r>
+        <w:rPr>
+          <w:rFonts w:asciiTheme="majorBidi" w:hAnsiTheme="majorBidi" w:cstheme="majorBidi"/>
+          <w:b/>
+          <w:sz w:val="22"/>
+          <w:szCs w:val="22"/>
+        </w:rPr>
+        <w:t>{{ SOCIETE</w:t>
+      </w:r>
+      <w:proofErr w:type="gramEnd"/>
+      <w:r>
+        <w:rPr>
+          <w:rFonts w:asciiTheme="majorBidi" w:hAnsiTheme="majorBidi" w:cstheme="majorBidi"/>
+          <w:b/>
+          <w:sz w:val="22"/>
+          <w:szCs w:val="22"/>
+        </w:rPr>
+        <w:t>_PART_</w:t>
+      </w:r>
+      <w:proofErr w:type="gramStart"/>
+      <w:r>
+        <w:rPr>
+          <w:rFonts w:asciiTheme="majorBidi" w:hAnsiTheme="majorBidi" w:cstheme="majorBidi"/>
+          <w:b/>
+          <w:sz w:val="22"/>
+          <w:szCs w:val="22"/>
+        </w:rPr>
+        <w:t>SOCIAL }</w:t>
+      </w:r>
+      <w:proofErr w:type="gramEnd"/>
+      <w:r>
+        <w:rPr>
+          <w:rFonts w:asciiTheme="majorBidi" w:hAnsiTheme="majorBidi" w:cstheme="majorBidi"/>
+          <w:b/>
+          <w:sz w:val="22"/>
+          <w:szCs w:val="22"/>
+        </w:rPr>
+        <w:t>} Parts</w:t>
+      </w:r>
+    </w:p>
+    <w:p>
+      <w:pPr>
+        <w:spacing w:line="360" w:lineRule="auto"/>
+        <w:rPr>
+          <w:rFonts w:asciiTheme="majorBidi" w:hAnsiTheme="majorBidi" w:cstheme="majorBidi"/>
+          <w:b/>
+          <w:sz w:val="22"/>
+          <w:szCs w:val="22"/>
+          <w:lang w:val="en-US"/>
+        </w:rPr>
+      </w:pPr>
+      <w:r>
+        <w:rPr>
+          <w:rFonts w:asciiTheme="majorBidi" w:hAnsiTheme="majorBidi" w:cstheme="majorBidi"/>
+          <w:b/>
+          <w:sz w:val="22"/>
+          <w:szCs w:val="22"/>
+          <w:lang w:val="en-US"/>
+        </w:rPr>
+        <w:t xml:space="preserve">{%p for a in associes where </w:t>
+      </w:r>
+      <w:proofErr w:type="spellStart"/>
+      <w:r>
+        <w:rPr>
+          <w:rFonts w:asciiTheme="majorBidi" w:hAnsiTheme="majorBidi" w:cstheme="majorBidi"/>
+          <w:b/>
+          <w:sz w:val="22"/>
+          <w:szCs w:val="22"/>
+          <w:lang w:val="en-US"/>
+        </w:rPr>
+        <w:t>a.EST_GERANT</w:t>
+      </w:r>
+      <w:proofErr w:type="spellEnd"/>
+      <w:r>
+        <w:rPr>
+          <w:rFonts w:asciiTheme="majorBidi" w:hAnsiTheme="majorBidi" w:cstheme="majorBidi"/>
+          <w:b/>
+          <w:sz w:val="22"/>
+          <w:szCs w:val="22"/>
+          <w:lang w:val="en-US"/>
+        </w:rPr>
+        <w:t xml:space="preserve"> == '</w:t>
+      </w:r>
+      <w:proofErr w:type="spellStart"/>
+      <w:r>
+        <w:rPr>
+          <w:rFonts w:asciiTheme="majorBidi" w:hAnsiTheme="majorBidi" w:cstheme="majorBidi"/>
+          <w:b/>
+          <w:sz w:val="22"/>
+          <w:szCs w:val="22"/>
+          <w:lang w:val="en-US"/>
+        </w:rPr>
+        <w:t>Gerant</w:t>
+      </w:r>
+      <w:proofErr w:type="spellEnd"/>
+      <w:r>
+        <w:rPr>
+          <w:rFonts w:asciiTheme="majorBidi" w:hAnsiTheme="majorBidi" w:cstheme="majorBidi"/>
+          <w:b/>
+          <w:sz w:val="22"/>
+          <w:szCs w:val="22"/>
+          <w:lang w:val="en-US"/>
+        </w:rPr>
+        <w:t>' %}</w:t>
       </w:r>
     </w:p>
     <w:p>
@@ -1101,21 +1126,148 @@
           <w:ilvl w:val="0"/>
           <w:numId w:val="10"/>
         </w:numPr>
+        <w:spacing w:line="360" w:lineRule="auto"/>
         <w:ind w:left="567"/>
         <w:jc w:val="both"/>
         <w:rPr>
           <w:rFonts w:asciiTheme="majorBidi" w:hAnsiTheme="majorBidi" w:cstheme="majorBidi"/>
-          <w:bCs/>
-          <w:sz w:val="18"/>
-          <w:szCs w:val="18"/>
-        </w:rPr>
-      </w:pPr>
-      <w:r>
-        <w:rPr>
-          <w:rFonts w:asciiTheme="majorBidi" w:hAnsiTheme="majorBidi" w:cstheme="majorBidi"/>
-          <w:b/>
-          <w:sz w:val="18"/>
-          <w:szCs w:val="18"/>
+          <w:b/>
+          <w:sz w:val="22"/>
+          <w:szCs w:val="22"/>
+        </w:rPr>
+      </w:pPr>
+      <w:r>
+        <w:rPr>
+          <w:rFonts w:asciiTheme="majorBidi" w:hAnsiTheme="majorBidi" w:cstheme="majorBidi"/>
+          <w:b/>
+          <w:sz w:val="22"/>
+          <w:szCs w:val="22"/>
+        </w:rPr>
+        <w:t xml:space="preserve">Gérance : La société sera gérée par </w:t>
+      </w:r>
+      <w:proofErr w:type="gramStart"/>
+      <w:r>
+        <w:rPr>
+          <w:rFonts w:asciiTheme="majorBidi" w:hAnsiTheme="majorBidi" w:cstheme="majorBidi"/>
+          <w:b/>
+          <w:sz w:val="22"/>
+          <w:szCs w:val="22"/>
+        </w:rPr>
+        <w:t xml:space="preserve">{{ </w:t>
+      </w:r>
+      <w:proofErr w:type="spellStart"/>
+      <w:r>
+        <w:rPr>
+          <w:rFonts w:asciiTheme="majorBidi" w:hAnsiTheme="majorBidi" w:cstheme="majorBidi"/>
+          <w:b/>
+          <w:sz w:val="22"/>
+          <w:szCs w:val="22"/>
+        </w:rPr>
+        <w:t>a.NOM</w:t>
+      </w:r>
+      <w:proofErr w:type="gramEnd"/>
+      <w:r>
+        <w:rPr>
+          <w:rFonts w:asciiTheme="majorBidi" w:hAnsiTheme="majorBidi" w:cstheme="majorBidi"/>
+          <w:b/>
+          <w:sz w:val="22"/>
+          <w:szCs w:val="22"/>
+        </w:rPr>
+        <w:t>_</w:t>
+      </w:r>
+      <w:proofErr w:type="gramStart"/>
+      <w:r>
+        <w:rPr>
+          <w:rFonts w:asciiTheme="majorBidi" w:hAnsiTheme="majorBidi" w:cstheme="majorBidi"/>
+          <w:b/>
+          <w:sz w:val="22"/>
+          <w:szCs w:val="22"/>
+        </w:rPr>
+        <w:t>COMPLET</w:t>
+      </w:r>
+      <w:proofErr w:type="spellEnd"/>
+      <w:r>
+        <w:rPr>
+          <w:rFonts w:asciiTheme="majorBidi" w:hAnsiTheme="majorBidi" w:cstheme="majorBidi"/>
+          <w:b/>
+          <w:sz w:val="22"/>
+          <w:szCs w:val="22"/>
+        </w:rPr>
+        <w:t xml:space="preserve"> }</w:t>
+      </w:r>
+      <w:proofErr w:type="gramEnd"/>
+      <w:r>
+        <w:rPr>
+          <w:rFonts w:asciiTheme="majorBidi" w:hAnsiTheme="majorBidi" w:cstheme="majorBidi"/>
+          <w:b/>
+          <w:sz w:val="22"/>
+          <w:szCs w:val="22"/>
+        </w:rPr>
+        <w:t>}, en qualité de gérant.</w:t>
+      </w:r>
+    </w:p>
+    <w:p>
+      <w:pPr>
+        <w:spacing w:line="360" w:lineRule="auto"/>
+        <w:jc w:val="both"/>
+        <w:rPr>
+          <w:rFonts w:asciiTheme="majorBidi" w:hAnsiTheme="majorBidi" w:cstheme="majorBidi"/>
+          <w:b/>
+          <w:sz w:val="22"/>
+          <w:szCs w:val="22"/>
+        </w:rPr>
+      </w:pPr>
+      <w:r>
+        <w:rPr>
+          <w:rFonts w:asciiTheme="majorBidi" w:hAnsiTheme="majorBidi" w:cstheme="majorBidi"/>
+          <w:b/>
+          <w:sz w:val="22"/>
+          <w:szCs w:val="22"/>
+        </w:rPr>
+        <w:t xml:space="preserve">{%p </w:t>
+      </w:r>
+      <w:proofErr w:type="spellStart"/>
+      <w:r>
+        <w:rPr>
+          <w:rFonts w:asciiTheme="majorBidi" w:hAnsiTheme="majorBidi" w:cstheme="majorBidi"/>
+          <w:b/>
+          <w:sz w:val="22"/>
+          <w:szCs w:val="22"/>
+        </w:rPr>
+        <w:t>endfor</w:t>
+      </w:r>
+      <w:proofErr w:type="spellEnd"/>
+      <w:r>
+        <w:rPr>
+          <w:rFonts w:asciiTheme="majorBidi" w:hAnsiTheme="majorBidi" w:cstheme="majorBidi"/>
+          <w:b/>
+          <w:sz w:val="22"/>
+          <w:szCs w:val="22"/>
+        </w:rPr>
+        <w:t xml:space="preserve"> %}</w:t>
+      </w:r>
+    </w:p>
+    <w:p>
+      <w:pPr>
+        <w:pStyle w:val="Paragraphedeliste"/>
+        <w:numPr>
+          <w:ilvl w:val="0"/>
+          <w:numId w:val="10"/>
+        </w:numPr>
+        <w:spacing w:line="360" w:lineRule="auto"/>
+        <w:rPr>
+          <w:rFonts w:asciiTheme="majorBidi" w:hAnsiTheme="majorBidi" w:cstheme="majorBidi"/>
+          <w:b/>
+          <w:sz w:val="22"/>
+          <w:szCs w:val="22"/>
+        </w:rPr>
+      </w:pPr>
+      <w:r>
+        <w:rPr>
+          <w:rFonts w:asciiTheme="majorBidi" w:hAnsiTheme="majorBidi" w:cstheme="majorBidi"/>
+          <w:b/>
+          <w:sz w:val="22"/>
+          <w:szCs w:val="22"/>
         </w:rPr>
         <w:t>Année Sociale</w:t>
       </w:r>
@@ -1123,8 +1275,8 @@
         <w:rPr>
           <w:rFonts w:asciiTheme="majorBidi" w:hAnsiTheme="majorBidi" w:cstheme="majorBidi"/>
           <w:b/>
-          <w:sz w:val="18"/>
-          <w:szCs w:val="18"/>
+          <w:sz w:val="22"/>
+          <w:szCs w:val="22"/>
         </w:rPr>
         <w:t xml:space="preserve"> </w:t>
       </w:r>
@@ -1132,53 +1284,44 @@
         <w:rPr>
           <w:rFonts w:asciiTheme="majorBidi" w:hAnsiTheme="majorBidi" w:cstheme="majorBidi"/>
           <w:b/>
-          <w:sz w:val="18"/>
-          <w:szCs w:val="18"/>
-        </w:rPr>
-        <w:t>:</w:t>
-      </w:r>
-      <w:r>
-        <w:rPr>
-          <w:rFonts w:asciiTheme="majorBidi" w:hAnsiTheme="majorBidi" w:cstheme="majorBidi"/>
-          <w:bCs/>
-          <w:sz w:val="18"/>
-          <w:szCs w:val="18"/>
-        </w:rPr>
-        <w:t xml:space="preserve"> du 1er </w:t>
-      </w:r>
-      <w:r>
-        <w:rPr>
-          <w:rFonts w:asciiTheme="majorBidi" w:hAnsiTheme="majorBidi" w:cstheme="majorBidi"/>
-          <w:bCs/>
-          <w:sz w:val="18"/>
-          <w:szCs w:val="18"/>
+          <w:sz w:val="22"/>
+          <w:szCs w:val="22"/>
+        </w:rPr>
+        <w:t xml:space="preserve">: du 1er </w:t>
+      </w:r>
+      <w:r>
+        <w:rPr>
+          <w:rFonts w:asciiTheme="majorBidi" w:hAnsiTheme="majorBidi" w:cstheme="majorBidi"/>
+          <w:b/>
+          <w:sz w:val="22"/>
+          <w:szCs w:val="22"/>
         </w:rPr>
         <w:t>janvier</w:t>
       </w:r>
       <w:r>
         <w:rPr>
           <w:rFonts w:asciiTheme="majorBidi" w:hAnsiTheme="majorBidi" w:cstheme="majorBidi"/>
-          <w:bCs/>
-          <w:sz w:val="18"/>
-          <w:szCs w:val="18"/>
+          <w:b/>
+          <w:sz w:val="22"/>
+          <w:szCs w:val="22"/>
         </w:rPr>
         <w:t xml:space="preserve"> au 31 Décembre</w:t>
       </w:r>
       <w:r>
         <w:rPr>
           <w:rFonts w:asciiTheme="majorBidi" w:hAnsiTheme="majorBidi" w:cstheme="majorBidi"/>
-          <w:bCs/>
-          <w:sz w:val="18"/>
-          <w:szCs w:val="18"/>
+          <w:b/>
+          <w:sz w:val="22"/>
+          <w:szCs w:val="22"/>
         </w:rPr>
         <w:t>.</w:t>
       </w:r>
       <w:r>
         <w:rPr>
           <w:rFonts w:asciiTheme="majorBidi" w:hAnsiTheme="majorBidi" w:cstheme="majorBidi"/>
-          <w:bCs/>
-          <w:sz w:val="18"/>
-          <w:szCs w:val="18"/>
+          <w:b/>
+          <w:sz w:val="22"/>
+          <w:szCs w:val="22"/>
         </w:rPr>
         <w:t xml:space="preserve"> </w:t>
       </w:r>
@@ -1191,8 +1334,8 @@
         <w:rPr>
           <w:rFonts w:asciiTheme="majorBidi" w:hAnsiTheme="majorBidi" w:cstheme="majorBidi"/>
           <w:bCs/>
-          <w:sz w:val="18"/>
-          <w:szCs w:val="18"/>
+          <w:sz w:val="22"/>
+          <w:szCs w:val="22"/>
         </w:rPr>
       </w:pPr>
       <w:bookmarkStart w:id="0" w:name="LastPosition"/>
@@ -1203,16 +1346,16 @@
         <w:rPr>
           <w:rFonts w:asciiTheme="majorBidi" w:hAnsiTheme="majorBidi" w:cstheme="majorBidi"/>
           <w:b/>
-          <w:sz w:val="18"/>
-          <w:szCs w:val="18"/>
-        </w:rPr>
-      </w:pPr>
-      <w:r>
-        <w:rPr>
-          <w:rFonts w:asciiTheme="majorBidi" w:hAnsiTheme="majorBidi" w:cstheme="majorBidi"/>
-          <w:b/>
-          <w:sz w:val="18"/>
-          <w:szCs w:val="18"/>
+          <w:sz w:val="22"/>
+          <w:szCs w:val="22"/>
+        </w:rPr>
+      </w:pPr>
+      <w:r>
+        <w:rPr>
+          <w:rFonts w:asciiTheme="majorBidi" w:hAnsiTheme="majorBidi" w:cstheme="majorBidi"/>
+          <w:b/>
+          <w:sz w:val="22"/>
+          <w:szCs w:val="22"/>
         </w:rPr>
         <w:t>II</w:t>
       </w:r>
@@ -1220,8 +1363,8 @@
         <w:rPr>
           <w:rFonts w:asciiTheme="majorBidi" w:hAnsiTheme="majorBidi" w:cstheme="majorBidi"/>
           <w:b/>
-          <w:sz w:val="18"/>
-          <w:szCs w:val="18"/>
+          <w:sz w:val="22"/>
+          <w:szCs w:val="22"/>
         </w:rPr>
         <w:t>/</w:t>
       </w:r>
@@ -1229,8 +1372,8 @@
         <w:rPr>
           <w:rFonts w:asciiTheme="majorBidi" w:hAnsiTheme="majorBidi" w:cstheme="majorBidi"/>
           <w:bCs/>
-          <w:sz w:val="18"/>
-          <w:szCs w:val="18"/>
+          <w:sz w:val="22"/>
+          <w:szCs w:val="22"/>
         </w:rPr>
         <w:t xml:space="preserve"> Le</w:t>
       </w:r>
@@ -1238,8 +1381,8 @@
         <w:rPr>
           <w:rFonts w:asciiTheme="majorBidi" w:hAnsiTheme="majorBidi" w:cstheme="majorBidi"/>
           <w:bCs/>
-          <w:sz w:val="18"/>
-          <w:szCs w:val="18"/>
+          <w:sz w:val="22"/>
+          <w:szCs w:val="22"/>
         </w:rPr>
         <w:t xml:space="preserve">   dépôt   légal   est</w:t>
       </w:r>
@@ -1247,8 +1390,8 @@
         <w:rPr>
           <w:rFonts w:asciiTheme="majorBidi" w:hAnsiTheme="majorBidi" w:cstheme="majorBidi"/>
           <w:bCs/>
-          <w:sz w:val="18"/>
-          <w:szCs w:val="18"/>
+          <w:sz w:val="22"/>
+          <w:szCs w:val="22"/>
         </w:rPr>
         <w:t xml:space="preserve"> effectué   au   greffe du </w:t>
       </w:r>
@@ -1256,8 +1399,8 @@
         <w:rPr>
           <w:rFonts w:asciiTheme="majorBidi" w:hAnsiTheme="majorBidi" w:cstheme="majorBidi"/>
           <w:bCs/>
-          <w:sz w:val="18"/>
-          <w:szCs w:val="18"/>
+          <w:sz w:val="22"/>
+          <w:szCs w:val="22"/>
         </w:rPr>
         <w:t>tribunal</w:t>
       </w:r>
@@ -1265,8 +1408,8 @@
         <w:rPr>
           <w:rFonts w:asciiTheme="majorBidi" w:hAnsiTheme="majorBidi" w:cstheme="majorBidi"/>
           <w:bCs/>
-          <w:sz w:val="18"/>
-          <w:szCs w:val="18"/>
+          <w:sz w:val="22"/>
+          <w:szCs w:val="22"/>
         </w:rPr>
         <w:t xml:space="preserve"> de commerce d</w:t>
       </w:r>
@@ -1274,8 +1417,8 @@
         <w:rPr>
           <w:rFonts w:asciiTheme="majorBidi" w:hAnsiTheme="majorBidi" w:cstheme="majorBidi"/>
           <w:bCs/>
-          <w:sz w:val="18"/>
-          <w:szCs w:val="18"/>
+          <w:sz w:val="22"/>
+          <w:szCs w:val="22"/>
         </w:rPr>
         <w:t>e Casa</w:t>
       </w:r>
@@ -1283,8 +1426,8 @@
         <w:rPr>
           <w:rFonts w:asciiTheme="majorBidi" w:hAnsiTheme="majorBidi" w:cstheme="majorBidi"/>
           <w:bCs/>
-          <w:sz w:val="18"/>
-          <w:szCs w:val="18"/>
+          <w:sz w:val="22"/>
+          <w:szCs w:val="22"/>
         </w:rPr>
         <w:t>blanca</w:t>
       </w:r>
@@ -1292,8 +1435,8 @@
         <w:rPr>
           <w:rFonts w:asciiTheme="majorBidi" w:hAnsiTheme="majorBidi" w:cstheme="majorBidi"/>
           <w:bCs/>
-          <w:sz w:val="18"/>
-          <w:szCs w:val="18"/>
+          <w:sz w:val="22"/>
+          <w:szCs w:val="22"/>
         </w:rPr>
         <w:t>, sous le N</w:t>
       </w:r>
@@ -1301,8 +1444,8 @@
         <w:rPr>
           <w:rFonts w:asciiTheme="majorBidi" w:hAnsiTheme="majorBidi" w:cstheme="majorBidi"/>
           <w:b/>
-          <w:sz w:val="18"/>
-          <w:szCs w:val="18"/>
+          <w:sz w:val="22"/>
+          <w:szCs w:val="22"/>
         </w:rPr>
         <w:t>°</w:t>
       </w:r>
@@ -1310,8 +1453,8 @@
         <w:rPr>
           <w:rFonts w:asciiTheme="majorBidi" w:hAnsiTheme="majorBidi" w:cstheme="majorBidi"/>
           <w:b/>
-          <w:sz w:val="18"/>
-          <w:szCs w:val="18"/>
+          <w:sz w:val="22"/>
+          <w:szCs w:val="22"/>
         </w:rPr>
         <w:t xml:space="preserve"> </w:t>
       </w:r>
@@ -1319,17 +1462,37 @@
         <w:rPr>
           <w:rFonts w:asciiTheme="majorBidi" w:hAnsiTheme="majorBidi" w:cstheme="majorBidi"/>
           <w:b/>
-          <w:sz w:val="18"/>
-          <w:szCs w:val="18"/>
-        </w:rPr>
-        <w:t>{{ SOCIETE_RC }}</w:t>
-      </w:r>
-      <w:r>
-        <w:rPr>
-          <w:rFonts w:asciiTheme="majorBidi" w:hAnsiTheme="majorBidi" w:cstheme="majorBidi"/>
-          <w:bCs/>
-          <w:sz w:val="18"/>
-          <w:szCs w:val="18"/>
+          <w:sz w:val="22"/>
+          <w:szCs w:val="22"/>
+        </w:rPr>
+        <w:t>……………</w:t>
+      </w:r>
+      <w:proofErr w:type="gramStart"/>
+      <w:r>
+        <w:rPr>
+          <w:rFonts w:asciiTheme="majorBidi" w:hAnsiTheme="majorBidi" w:cstheme="majorBidi"/>
+          <w:b/>
+          <w:sz w:val="22"/>
+          <w:szCs w:val="22"/>
+        </w:rPr>
+        <w:t>……</w:t>
+      </w:r>
+      <w:r>
+        <w:rPr>
+          <w:rFonts w:asciiTheme="majorBidi" w:hAnsiTheme="majorBidi" w:cstheme="majorBidi"/>
+          <w:b/>
+          <w:sz w:val="22"/>
+          <w:szCs w:val="22"/>
+        </w:rPr>
+        <w:t>.</w:t>
+      </w:r>
+      <w:proofErr w:type="gramEnd"/>
+      <w:r>
+        <w:rPr>
+          <w:rFonts w:asciiTheme="majorBidi" w:hAnsiTheme="majorBidi" w:cstheme="majorBidi"/>
+          <w:bCs/>
+          <w:sz w:val="22"/>
+          <w:szCs w:val="22"/>
         </w:rPr>
         <w:t>,</w:t>
       </w:r>
@@ -1337,8 +1500,8 @@
         <w:rPr>
           <w:rFonts w:asciiTheme="majorBidi" w:hAnsiTheme="majorBidi" w:cstheme="majorBidi"/>
           <w:bCs/>
-          <w:sz w:val="18"/>
-          <w:szCs w:val="18"/>
+          <w:sz w:val="22"/>
+          <w:szCs w:val="22"/>
         </w:rPr>
         <w:t xml:space="preserve"> </w:t>
       </w:r>
@@ -1346,8 +1509,8 @@
         <w:rPr>
           <w:rFonts w:asciiTheme="majorBidi" w:hAnsiTheme="majorBidi" w:cstheme="majorBidi"/>
           <w:bCs/>
-          <w:sz w:val="18"/>
-          <w:szCs w:val="18"/>
+          <w:sz w:val="22"/>
+          <w:szCs w:val="22"/>
         </w:rPr>
         <w:t>et elle a pris comme N° RC :</w:t>
       </w:r>
@@ -1355,8 +1518,8 @@
         <w:rPr>
           <w:rFonts w:asciiTheme="majorBidi" w:hAnsiTheme="majorBidi" w:cstheme="majorBidi"/>
           <w:bCs/>
-          <w:sz w:val="18"/>
-          <w:szCs w:val="18"/>
+          <w:sz w:val="22"/>
+          <w:szCs w:val="22"/>
         </w:rPr>
         <w:t xml:space="preserve"> </w:t>
       </w:r>
@@ -1364,8 +1527,8 @@
         <w:rPr>
           <w:rFonts w:asciiTheme="majorBidi" w:hAnsiTheme="majorBidi" w:cstheme="majorBidi"/>
           <w:bCs/>
-          <w:sz w:val="18"/>
-          <w:szCs w:val="18"/>
+          <w:sz w:val="22"/>
+          <w:szCs w:val="22"/>
         </w:rPr>
         <w:t>N</w:t>
       </w:r>
@@ -1373,62 +1536,84 @@
         <w:rPr>
           <w:rFonts w:asciiTheme="majorBidi" w:hAnsiTheme="majorBidi" w:cstheme="majorBidi"/>
           <w:bCs/>
-          <w:sz w:val="18"/>
-          <w:szCs w:val="18"/>
+          <w:sz w:val="22"/>
+          <w:szCs w:val="22"/>
         </w:rPr>
         <w:t xml:space="preserve">° </w:t>
       </w:r>
-      <w:r>
-        <w:rPr>
-          <w:rFonts w:asciiTheme="majorBidi" w:hAnsiTheme="majorBidi" w:cstheme="majorBidi"/>
-          <w:b/>
-          <w:sz w:val="18"/>
-          <w:szCs w:val="18"/>
-        </w:rPr>
-        <w:t>{{ SOCIETE_RC }}</w:t>
-      </w:r>
-      <w:r>
-        <w:rPr>
-          <w:rFonts w:asciiTheme="majorBidi" w:hAnsiTheme="majorBidi" w:cstheme="majorBidi"/>
-          <w:b/>
-          <w:sz w:val="18"/>
-          <w:szCs w:val="18"/>
+      <w:proofErr w:type="gramStart"/>
+      <w:r>
+        <w:rPr>
+          <w:rFonts w:asciiTheme="majorBidi" w:hAnsiTheme="majorBidi" w:cstheme="majorBidi"/>
+          <w:b/>
+          <w:sz w:val="22"/>
+          <w:szCs w:val="22"/>
+        </w:rPr>
+        <w:t>{{ SOCIETE</w:t>
+      </w:r>
+      <w:proofErr w:type="gramEnd"/>
+      <w:r>
+        <w:rPr>
+          <w:rFonts w:asciiTheme="majorBidi" w:hAnsiTheme="majorBidi" w:cstheme="majorBidi"/>
+          <w:b/>
+          <w:sz w:val="22"/>
+          <w:szCs w:val="22"/>
+        </w:rPr>
+        <w:t>_</w:t>
+      </w:r>
+      <w:proofErr w:type="gramStart"/>
+      <w:r>
+        <w:rPr>
+          <w:rFonts w:asciiTheme="majorBidi" w:hAnsiTheme="majorBidi" w:cstheme="majorBidi"/>
+          <w:b/>
+          <w:sz w:val="22"/>
+          <w:szCs w:val="22"/>
+        </w:rPr>
+        <w:t>RC }</w:t>
+      </w:r>
+      <w:proofErr w:type="gramEnd"/>
+      <w:r>
+        <w:rPr>
+          <w:rFonts w:asciiTheme="majorBidi" w:hAnsiTheme="majorBidi" w:cstheme="majorBidi"/>
+          <w:b/>
+          <w:sz w:val="22"/>
+          <w:szCs w:val="22"/>
+        </w:rPr>
+        <w:t xml:space="preserve">} </w:t>
+      </w:r>
+      <w:r>
+        <w:rPr>
+          <w:rFonts w:asciiTheme="majorBidi" w:hAnsiTheme="majorBidi" w:cstheme="majorBidi"/>
+          <w:bCs/>
+          <w:sz w:val="22"/>
+          <w:szCs w:val="22"/>
+        </w:rPr>
+        <w:t>et ceci en date du</w:t>
+      </w:r>
+      <w:r>
+        <w:rPr>
+          <w:rFonts w:asciiTheme="majorBidi" w:hAnsiTheme="majorBidi" w:cstheme="majorBidi"/>
+          <w:b/>
+          <w:sz w:val="22"/>
+          <w:szCs w:val="22"/>
         </w:rPr>
         <w:t xml:space="preserve"> </w:t>
       </w:r>
       <w:r>
         <w:rPr>
           <w:rFonts w:asciiTheme="majorBidi" w:hAnsiTheme="majorBidi" w:cstheme="majorBidi"/>
-          <w:bCs/>
-          <w:sz w:val="18"/>
-          <w:szCs w:val="18"/>
-        </w:rPr>
-        <w:t>et ceci en date du</w:t>
-      </w:r>
-      <w:r>
-        <w:rPr>
-          <w:rFonts w:asciiTheme="majorBidi" w:hAnsiTheme="majorBidi" w:cstheme="majorBidi"/>
-          <w:b/>
-          <w:sz w:val="18"/>
-          <w:szCs w:val="18"/>
-        </w:rPr>
-        <w:t xml:space="preserve"> </w:t>
-      </w:r>
-      <w:r>
-        <w:rPr>
-          <w:rFonts w:asciiTheme="majorBidi" w:hAnsiTheme="majorBidi" w:cstheme="majorBidi"/>
-          <w:b/>
-          <w:sz w:val="18"/>
-          <w:szCs w:val="18"/>
-        </w:rPr>
-        <w:t>{{ CONTRAT_TYPE }}</w:t>
-      </w:r>
-      <w:r>
-        <w:rPr>
-          <w:rFonts w:asciiTheme="majorBidi" w:hAnsiTheme="majorBidi" w:cstheme="majorBidi"/>
-          <w:b/>
-          <w:sz w:val="18"/>
-          <w:szCs w:val="18"/>
+          <w:b/>
+          <w:sz w:val="22"/>
+          <w:szCs w:val="22"/>
+        </w:rPr>
+        <w:t>…………………..</w:t>
+      </w:r>
+      <w:r>
+        <w:rPr>
+          <w:rFonts w:asciiTheme="majorBidi" w:hAnsiTheme="majorBidi" w:cstheme="majorBidi"/>
+          <w:b/>
+          <w:sz w:val="22"/>
+          <w:szCs w:val="22"/>
         </w:rPr>
         <w:t>.</w:t>
       </w:r>
@@ -1439,8 +1624,8 @@
         <w:rPr>
           <w:rFonts w:asciiTheme="majorBidi" w:hAnsiTheme="majorBidi" w:cstheme="majorBidi"/>
           <w:bCs/>
-          <w:sz w:val="18"/>
-          <w:szCs w:val="18"/>
+          <w:sz w:val="22"/>
+          <w:szCs w:val="22"/>
         </w:rPr>
       </w:pPr>
     </w:p>
@@ -1459,7 +1644,7 @@
       </w:pPr>
     </w:p>
     <w:sectPr>
-      <w:pgSz w:w="11906" w:h="16838"/>
+      <w:pgSz w:w="16838" w:h="11906" w:orient="landscape"/>
       <w:pgMar w:top="1417" w:right="1417" w:bottom="1417" w:left="1417" w:header="708" w:footer="708" w:gutter="0"/>
       <w:cols w:space="708"/>
       <w:docGrid w:linePitch="360"/>
@@ -1469,7 +1654,7 @@
 </file>
 
 <file path=word/endnotes.xml><?xml version="1.0" encoding="utf-8"?>
-<w:endnotes xmlns:wpc="http://schemas.microsoft.com/office/word/2010/wordprocessingCanvas" xmlns:cx="http://schemas.microsoft.com/office/drawing/2014/chartex" xmlns:cx1="http://schemas.microsoft.com/office/drawing/2015/9/8/chartex" xmlns:cx2="http://schemas.microsoft.com/office/drawing/2015/10/21/chartex" xmlns:cx3="http://schemas.microsoft.com/office/drawing/2016/5/9/chartex" xmlns:cx4="http://schemas.microsoft.com/office/drawing/2016/5/10/chartex" xmlns:cx5="http://schemas.microsoft.com/office/drawing/2016/5/11/chartex" xmlns:cx6="http://schemas.microsoft.com/office/drawing/2016/5/12/chartex" xmlns:cx7="http://schemas.microsoft.com/office/drawing/2016/5/13/chartex" xmlns:cx8="http://schemas.microsoft.com/office/drawing/2016/5/14/chartex" xmlns:mc="http://schemas.openxmlformats.org/markup-compatibility/2006" xmlns:aink="http://schemas.microsoft.com/office/drawing/2016/ink" xmlns:am3d="http://schemas.microsoft.com/office/drawing/2017/model3d" xmlns:o="urn:schemas-microsoft-com:office:office" xmlns:oel="http://schemas.microsoft.com/office/2019/extlst" xmlns:r="http://schemas.openxmlformats.org/officeDocument/2006/relationships" xmlns:m="http://schemas.openxmlformats.org/officeDocument/2006/math" xmlns:v="urn:schemas-microsoft-com:vml" xmlns:wp14="http://schemas.microsoft.com/office/word/2010/wordprocessingDrawing" xmlns:wp="http://schemas.openxmlformats.org/drawingml/2006/wordprocessingDrawing" xmlns:w10="urn:schemas-microsoft-com:office:word" xmlns:w="http://schemas.openxmlformats.org/wordprocessingml/2006/main" xmlns:w14="http://schemas.microsoft.com/office/word/2010/wordml" xmlns:w15="http://schemas.microsoft.com/office/word/2012/wordml" xmlns:w16cex="http://schemas.microsoft.com/office/word/2018/wordml/cex" xmlns:w16cid="http://schemas.microsoft.com/office/word/2016/wordml/cid" xmlns:w16="http://schemas.microsoft.com/office/word/2018/wordml" xmlns:w16sdtdh="http://schemas.microsoft.com/office/word/2020/wordml/sdtdatahash" xmlns:w16se="http://schemas.microsoft.com/office/word/2015/wordml/symex" xmlns:wpg="http://schemas.microsoft.com/office/word/2010/wordprocessingGroup" xmlns:wpi="http://schemas.microsoft.com/office/word/2010/wordprocessingInk" xmlns:wne="http://schemas.microsoft.com/office/word/2006/wordml" xmlns:wps="http://schemas.microsoft.com/office/word/2010/wordprocessingShape" mc:Ignorable="w14 w15 w16se w16cid w16 w16cex w16sdtdh wp14">
+<w:endnotes xmlns:wpc="http://schemas.microsoft.com/office/word/2010/wordprocessingCanvas" xmlns:cx="http://schemas.microsoft.com/office/drawing/2014/chartex" xmlns:cx1="http://schemas.microsoft.com/office/drawing/2015/9/8/chartex" xmlns:cx2="http://schemas.microsoft.com/office/drawing/2015/10/21/chartex" xmlns:cx3="http://schemas.microsoft.com/office/drawing/2016/5/9/chartex" xmlns:cx4="http://schemas.microsoft.com/office/drawing/2016/5/10/chartex" xmlns:cx5="http://schemas.microsoft.com/office/drawing/2016/5/11/chartex" xmlns:cx6="http://schemas.microsoft.com/office/drawing/2016/5/12/chartex" xmlns:cx7="http://schemas.microsoft.com/office/drawing/2016/5/13/chartex" xmlns:cx8="http://schemas.microsoft.com/office/drawing/2016/5/14/chartex" xmlns:mc="http://schemas.openxmlformats.org/markup-compatibility/2006" xmlns:aink="http://schemas.microsoft.com/office/drawing/2016/ink" xmlns:am3d="http://schemas.microsoft.com/office/drawing/2017/model3d" xmlns:o="urn:schemas-microsoft-com:office:office" xmlns:oel="http://schemas.microsoft.com/office/2019/extlst" xmlns:r="http://schemas.openxmlformats.org/officeDocument/2006/relationships" xmlns:m="http://schemas.openxmlformats.org/officeDocument/2006/math" xmlns:v="urn:schemas-microsoft-com:vml" xmlns:wp14="http://schemas.microsoft.com/office/word/2010/wordprocessingDrawing" xmlns:wp="http://schemas.openxmlformats.org/drawingml/2006/wordprocessingDrawing" xmlns:w10="urn:schemas-microsoft-com:office:word" xmlns:w="http://schemas.openxmlformats.org/wordprocessingml/2006/main" xmlns:w14="http://schemas.microsoft.com/office/word/2010/wordml" xmlns:w15="http://schemas.microsoft.com/office/word/2012/wordml" xmlns:w16cex="http://schemas.microsoft.com/office/word/2018/wordml/cex" xmlns:w16cid="http://schemas.microsoft.com/office/word/2016/wordml/cid" xmlns:w16="http://schemas.microsoft.com/office/word/2018/wordml" xmlns:w16du="http://schemas.microsoft.com/office/word/2023/wordml/word16du" xmlns:w16sdtdh="http://schemas.microsoft.com/office/word/2020/wordml/sdtdatahash" xmlns:w16sdtfl="http://schemas.microsoft.com/office/word/2024/wordml/sdtformatlock" xmlns:w16se="http://schemas.microsoft.com/office/word/2015/wordml/symex" xmlns:wpg="http://schemas.microsoft.com/office/word/2010/wordprocessingGroup" xmlns:wpi="http://schemas.microsoft.com/office/word/2010/wordprocessingInk" xmlns:wne="http://schemas.microsoft.com/office/word/2006/wordml" xmlns:wps="http://schemas.microsoft.com/office/word/2010/wordprocessingShape" mc:Ignorable="w14 w15 w16se w16cid w16 w16cex w16sdtdh w16sdtfl w16du wp14">
   <w:endnote w:type="separator" w:id="-1">
     <w:p>
       <w:r>
@@ -1488,7 +1673,7 @@
 </file>
 
 <file path=word/footnotes.xml><?xml version="1.0" encoding="utf-8"?>
-<w:footnotes xmlns:wpc="http://schemas.microsoft.com/office/word/2010/wordprocessingCanvas" xmlns:cx="http://schemas.microsoft.com/office/drawing/2014/chartex" xmlns:cx1="http://schemas.microsoft.com/office/drawing/2015/9/8/chartex" xmlns:cx2="http://schemas.microsoft.com/office/drawing/2015/10/21/chartex" xmlns:cx3="http://schemas.microsoft.com/office/drawing/2016/5/9/chartex" xmlns:cx4="http://schemas.microsoft.com/office/drawing/2016/5/10/chartex" xmlns:cx5="http://schemas.microsoft.com/office/drawing/2016/5/11/chartex" xmlns:cx6="http://schemas.microsoft.com/office/drawing/2016/5/12/chartex" xmlns:cx7="http://schemas.microsoft.com/office/drawing/2016/5/13/chartex" xmlns:cx8="http://schemas.microsoft.com/office/drawing/2016/5/14/chartex" xmlns:mc="http://schemas.openxmlformats.org/markup-compatibility/2006" xmlns:aink="http://schemas.microsoft.com/office/drawing/2016/ink" xmlns:am3d="http://schemas.microsoft.com/office/drawing/2017/model3d" xmlns:o="urn:schemas-microsoft-com:office:office" xmlns:oel="http://schemas.microsoft.com/office/2019/extlst" xmlns:r="http://schemas.openxmlformats.org/officeDocument/2006/relationships" xmlns:m="http://schemas.openxmlformats.org/officeDocument/2006/math" xmlns:v="urn:schemas-microsoft-com:vml" xmlns:wp14="http://schemas.microsoft.com/office/word/2010/wordprocessingDrawing" xmlns:wp="http://schemas.openxmlformats.org/drawingml/2006/wordprocessingDrawing" xmlns:w10="urn:schemas-microsoft-com:office:word" xmlns:w="http://schemas.openxmlformats.org/wordprocessingml/2006/main" xmlns:w14="http://schemas.microsoft.com/office/word/2010/wordml" xmlns:w15="http://schemas.microsoft.com/office/word/2012/wordml" xmlns:w16cex="http://schemas.microsoft.com/office/word/2018/wordml/cex" xmlns:w16cid="http://schemas.microsoft.com/office/word/2016/wordml/cid" xmlns:w16="http://schemas.microsoft.com/office/word/2018/wordml" xmlns:w16sdtdh="http://schemas.microsoft.com/office/word/2020/wordml/sdtdatahash" xmlns:w16se="http://schemas.microsoft.com/office/word/2015/wordml/symex" xmlns:wpg="http://schemas.microsoft.com/office/word/2010/wordprocessingGroup" xmlns:wpi="http://schemas.microsoft.com/office/word/2010/wordprocessingInk" xmlns:wne="http://schemas.microsoft.com/office/word/2006/wordml" xmlns:wps="http://schemas.microsoft.com/office/word/2010/wordprocessingShape" mc:Ignorable="w14 w15 w16se w16cid w16 w16cex w16sdtdh wp14">
+<w:footnotes xmlns:wpc="http://schemas.microsoft.com/office/word/2010/wordprocessingCanvas" xmlns:cx="http://schemas.microsoft.com/office/drawing/2014/chartex" xmlns:cx1="http://schemas.microsoft.com/office/drawing/2015/9/8/chartex" xmlns:cx2="http://schemas.microsoft.com/office/drawing/2015/10/21/chartex" xmlns:cx3="http://schemas.microsoft.com/office/drawing/2016/5/9/chartex" xmlns:cx4="http://schemas.microsoft.com/office/drawing/2016/5/10/chartex" xmlns:cx5="http://schemas.microsoft.com/office/drawing/2016/5/11/chartex" xmlns:cx6="http://schemas.microsoft.com/office/drawing/2016/5/12/chartex" xmlns:cx7="http://schemas.microsoft.com/office/drawing/2016/5/13/chartex" xmlns:cx8="http://schemas.microsoft.com/office/drawing/2016/5/14/chartex" xmlns:mc="http://schemas.openxmlformats.org/markup-compatibility/2006" xmlns:aink="http://schemas.microsoft.com/office/drawing/2016/ink" xmlns:am3d="http://schemas.microsoft.com/office/drawing/2017/model3d" xmlns:o="urn:schemas-microsoft-com:office:office" xmlns:oel="http://schemas.microsoft.com/office/2019/extlst" xmlns:r="http://schemas.openxmlformats.org/officeDocument/2006/relationships" xmlns:m="http://schemas.openxmlformats.org/officeDocument/2006/math" xmlns:v="urn:schemas-microsoft-com:vml" xmlns:wp14="http://schemas.microsoft.com/office/word/2010/wordprocessingDrawing" xmlns:wp="http://schemas.openxmlformats.org/drawingml/2006/wordprocessingDrawing" xmlns:w10="urn:schemas-microsoft-com:office:word" xmlns:w="http://schemas.openxmlformats.org/wordprocessingml/2006/main" xmlns:w14="http://schemas.microsoft.com/office/word/2010/wordml" xmlns:w15="http://schemas.microsoft.com/office/word/2012/wordml" xmlns:w16cex="http://schemas.microsoft.com/office/word/2018/wordml/cex" xmlns:w16cid="http://schemas.microsoft.com/office/word/2016/wordml/cid" xmlns:w16="http://schemas.microsoft.com/office/word/2018/wordml" xmlns:w16du="http://schemas.microsoft.com/office/word/2023/wordml/word16du" xmlns:w16sdtdh="http://schemas.microsoft.com/office/word/2020/wordml/sdtdatahash" xmlns:w16sdtfl="http://schemas.microsoft.com/office/word/2024/wordml/sdtformatlock" xmlns:w16se="http://schemas.microsoft.com/office/word/2015/wordml/symex" xmlns:wpg="http://schemas.microsoft.com/office/word/2010/wordprocessingGroup" xmlns:wpi="http://schemas.microsoft.com/office/word/2010/wordprocessingInk" xmlns:wne="http://schemas.microsoft.com/office/word/2006/wordml" xmlns:wps="http://schemas.microsoft.com/office/word/2010/wordprocessingShape" mc:Ignorable="w14 w15 w16se w16cid w16 w16cex w16sdtdh w16sdtfl w16du wp14">
   <w:footnote w:type="separator" w:id="-1">
     <w:p>
       <w:r>
@@ -1507,7 +1692,7 @@
 </file>
 
 <file path=word/numbering.xml><?xml version="1.0" encoding="utf-8"?>
-<w:numbering xmlns:wpc="http://schemas.microsoft.com/office/word/2010/wordprocessingCanvas" xmlns:cx="http://schemas.microsoft.com/office/drawing/2014/chartex" xmlns:cx1="http://schemas.microsoft.com/office/drawing/2015/9/8/chartex" xmlns:cx2="http://schemas.microsoft.com/office/drawing/2015/10/21/chartex" xmlns:cx3="http://schemas.microsoft.com/office/drawing/2016/5/9/chartex" xmlns:cx4="http://schemas.microsoft.com/office/drawing/2016/5/10/chartex" xmlns:cx5="http://schemas.microsoft.com/office/drawing/2016/5/11/chartex" xmlns:cx6="http://schemas.microsoft.com/office/drawing/2016/5/12/chartex" xmlns:cx7="http://schemas.microsoft.com/office/drawing/2016/5/13/chartex" xmlns:cx8="http://schemas.microsoft.com/office/drawing/2016/5/14/chartex" xmlns:mc="http://schemas.openxmlformats.org/markup-compatibility/2006" xmlns:aink="http://schemas.microsoft.com/office/drawing/2016/ink" xmlns:am3d="http://schemas.microsoft.com/office/drawing/2017/model3d" xmlns:o="urn:schemas-microsoft-com:office:office" xmlns:oel="http://schemas.microsoft.com/office/2019/extlst" xmlns:r="http://schemas.openxmlformats.org/officeDocument/2006/relationships" xmlns:m="http://schemas.openxmlformats.org/officeDocument/2006/math" xmlns:v="urn:schemas-microsoft-com:vml" xmlns:wp14="http://schemas.microsoft.com/office/word/2010/wordprocessingDrawing" xmlns:wp="http://schemas.openxmlformats.org/drawingml/2006/wordprocessingDrawing" xmlns:w10="urn:schemas-microsoft-com:office:word" xmlns:w="http://schemas.openxmlformats.org/wordprocessingml/2006/main" xmlns:w14="http://schemas.microsoft.com/office/word/2010/wordml" xmlns:w15="http://schemas.microsoft.com/office/word/2012/wordml" xmlns:w16cex="http://schemas.microsoft.com/office/word/2018/wordml/cex" xmlns:w16cid="http://schemas.microsoft.com/office/word/2016/wordml/cid" xmlns:w16="http://schemas.microsoft.com/office/word/2018/wordml" xmlns:w16sdtdh="http://schemas.microsoft.com/office/word/2020/wordml/sdtdatahash" xmlns:w16se="http://schemas.microsoft.com/office/word/2015/wordml/symex" xmlns:wpg="http://schemas.microsoft.com/office/word/2010/wordprocessingGroup" xmlns:wpi="http://schemas.microsoft.com/office/word/2010/wordprocessingInk" xmlns:wne="http://schemas.microsoft.com/office/word/2006/wordml" xmlns:wps="http://schemas.microsoft.com/office/word/2010/wordprocessingShape" mc:Ignorable="w14 w15 w16se w16cid w16 w16cex w16sdtdh wp14">
+<w:numbering xmlns:wpc="http://schemas.microsoft.com/office/word/2010/wordprocessingCanvas" xmlns:cx="http://schemas.microsoft.com/office/drawing/2014/chartex" xmlns:cx1="http://schemas.microsoft.com/office/drawing/2015/9/8/chartex" xmlns:cx2="http://schemas.microsoft.com/office/drawing/2015/10/21/chartex" xmlns:cx3="http://schemas.microsoft.com/office/drawing/2016/5/9/chartex" xmlns:cx4="http://schemas.microsoft.com/office/drawing/2016/5/10/chartex" xmlns:cx5="http://schemas.microsoft.com/office/drawing/2016/5/11/chartex" xmlns:cx6="http://schemas.microsoft.com/office/drawing/2016/5/12/chartex" xmlns:cx7="http://schemas.microsoft.com/office/drawing/2016/5/13/chartex" xmlns:cx8="http://schemas.microsoft.com/office/drawing/2016/5/14/chartex" xmlns:mc="http://schemas.openxmlformats.org/markup-compatibility/2006" xmlns:aink="http://schemas.microsoft.com/office/drawing/2016/ink" xmlns:am3d="http://schemas.microsoft.com/office/drawing/2017/model3d" xmlns:o="urn:schemas-microsoft-com:office:office" xmlns:oel="http://schemas.microsoft.com/office/2019/extlst" xmlns:r="http://schemas.openxmlformats.org/officeDocument/2006/relationships" xmlns:m="http://schemas.openxmlformats.org/officeDocument/2006/math" xmlns:v="urn:schemas-microsoft-com:vml" xmlns:wp14="http://schemas.microsoft.com/office/word/2010/wordprocessingDrawing" xmlns:wp="http://schemas.openxmlformats.org/drawingml/2006/wordprocessingDrawing" xmlns:w10="urn:schemas-microsoft-com:office:word" xmlns:w="http://schemas.openxmlformats.org/wordprocessingml/2006/main" xmlns:w14="http://schemas.microsoft.com/office/word/2010/wordml" xmlns:w15="http://schemas.microsoft.com/office/word/2012/wordml" xmlns:w16cex="http://schemas.microsoft.com/office/word/2018/wordml/cex" xmlns:w16cid="http://schemas.microsoft.com/office/word/2016/wordml/cid" xmlns:w16="http://schemas.microsoft.com/office/word/2018/wordml" xmlns:w16du="http://schemas.microsoft.com/office/word/2023/wordml/word16du" xmlns:w16sdtdh="http://schemas.microsoft.com/office/word/2020/wordml/sdtdatahash" xmlns:w16sdtfl="http://schemas.microsoft.com/office/word/2024/wordml/sdtformatlock" xmlns:w16se="http://schemas.microsoft.com/office/word/2015/wordml/symex" xmlns:wpg="http://schemas.microsoft.com/office/word/2010/wordprocessingGroup" xmlns:wpi="http://schemas.microsoft.com/office/word/2010/wordprocessingInk" xmlns:wne="http://schemas.microsoft.com/office/word/2006/wordml" xmlns:wps="http://schemas.microsoft.com/office/word/2010/wordprocessingShape" mc:Ignorable="w14 w15 w16se w16cid w16 w16cex w16sdtdh w16sdtfl w16du wp14">
   <w:numPicBullet w:numPicBulletId="0">
     <w:pict>
       <v:shapetype id="_x0000_t75" coordsize="21600,21600" o:spt="75" o:preferrelative="t" path="m@4@5l@4@11@9@11@9@5xe" filled="f" stroked="f">
@@ -1529,14 +1714,14 @@
         <v:path o:extrusionok="f" gradientshapeok="t" o:connecttype="rect"/>
         <o:lock v:ext="edit" aspectratio="t"/>
       </v:shapetype>
-      <v:shape id="_x0000_i1038" type="#_x0000_t75" style="width:11.25pt;height:11.25pt" o:bullet="t">
+      <v:shape id="_x0000_i1025" type="#_x0000_t75" style="width:11.4pt;height:11.4pt" o:bullet="t">
         <v:imagedata r:id="rId1" o:title="msoFA43"/>
       </v:shape>
     </w:pict>
   </w:numPicBullet>
   <w:numPicBullet w:numPicBulletId="1">
     <w:pict>
-      <v:shape id="_x0000_i1039" type="#_x0000_t75" style="width:11.25pt;height:11.25pt" o:bullet="t">
+      <v:shape id="_x0000_i1026" type="#_x0000_t75" style="width:11.4pt;height:11.4pt" o:bullet="t">
         <v:imagedata r:id="rId2" o:title="msoFA43"/>
       </v:shape>
     </w:pict>
@@ -2567,7 +2752,7 @@
   <w:abstractNum w:abstractNumId="9" w15:restartNumberingAfterBreak="0">
     <w:nsid w:val="58A3344A"/>
     <w:multiLevelType w:val="hybridMultilevel"/>
-    <w:tmpl w:val="0336A6D0"/>
+    <w:tmpl w:val="ED92799A"/>
     <w:lvl w:ilvl="0" w:tplc="040C0001">
       <w:start w:val="1"/>
       <w:numFmt w:val="bullet"/>
@@ -2942,7 +3127,7 @@
 </file>
 
 <file path=word/styles.xml><?xml version="1.0" encoding="utf-8"?>
-<w:styles xmlns:mc="http://schemas.openxmlformats.org/markup-compatibility/2006" xmlns:r="http://schemas.openxmlformats.org/officeDocument/2006/relationships" xmlns:w="http://schemas.openxmlformats.org/wordprocessingml/2006/main" xmlns:w14="http://schemas.microsoft.com/office/word/2010/wordml" xmlns:w15="http://schemas.microsoft.com/office/word/2012/wordml" xmlns:w16cex="http://schemas.microsoft.com/office/word/2018/wordml/cex" xmlns:w16cid="http://schemas.microsoft.com/office/word/2016/wordml/cid" xmlns:w16="http://schemas.microsoft.com/office/word/2018/wordml" xmlns:w16sdtdh="http://schemas.microsoft.com/office/word/2020/wordml/sdtdatahash" xmlns:w16se="http://schemas.microsoft.com/office/word/2015/wordml/symex" mc:Ignorable="w14 w15 w16se w16cid w16 w16cex w16sdtdh">
+<w:styles xmlns:mc="http://schemas.openxmlformats.org/markup-compatibility/2006" xmlns:r="http://schemas.openxmlformats.org/officeDocument/2006/relationships" xmlns:w="http://schemas.openxmlformats.org/wordprocessingml/2006/main" xmlns:w14="http://schemas.microsoft.com/office/word/2010/wordml" xmlns:w15="http://schemas.microsoft.com/office/word/2012/wordml" xmlns:w16cex="http://schemas.microsoft.com/office/word/2018/wordml/cex" xmlns:w16cid="http://schemas.microsoft.com/office/word/2016/wordml/cid" xmlns:w16="http://schemas.microsoft.com/office/word/2018/wordml" xmlns:w16du="http://schemas.microsoft.com/office/word/2023/wordml/word16du" xmlns:w16sdtdh="http://schemas.microsoft.com/office/word/2020/wordml/sdtdatahash" xmlns:w16sdtfl="http://schemas.microsoft.com/office/word/2024/wordml/sdtformatlock" xmlns:w16se="http://schemas.microsoft.com/office/word/2015/wordml/symex" mc:Ignorable="w14 w15 w16se w16cid w16 w16cex w16sdtdh w16sdtfl w16du">
   <w:docDefaults>
     <w:rPrDefault>
       <w:rPr>

</xml_diff>